<commit_message>
feat(content): link the Word AI policy template from three guides
- New Markdown link target `download:<template id>`: rendered as the Word
  download in the page's language (/downloads/<id>-<locale>.docx, DE
  fallback); an unknown id fails check:content and the build. The
  readiness check reuses the same resolver (src/templates/links.ts).
- Translation: the prompt keeps download: targets unchanged, and
  writeTranslation refuses output that drops or rewrites one.
- Links added in DE: ndsg-ai-basics (next steps, internal guidelines),
  ai-security-risks (tool register in the AI policy),
  ai-procurement-checklist (further reading). EN/FR/IT follow via the
  translate workflow on merge, with refreshed FR baselines.

Co-Authored-By: Claude Opus 5.5 <noreply@anthropic.com>
</commit_message>
<xml_diff>
--- a/public/downloads/ai-policy-template-de.docx
+++ b/public/downloads/ai-policy-template-de.docx
@@ -5,6 +5,7 @@
     <w:p>
       <w:pPr>
         <w:pStyle w:val="Title"/>
+        <w:keepNext/>
       </w:pPr>
       <w:r>
         <w:t xml:space="preserve">Vorlage: KI-Richtlinie für Schweizer KMU</w:t>
@@ -31,13 +32,14 @@
         <w:pStyle w:val="ListParagraph"/>
         <w:numPr>
           <w:ilvl w:val="0"/>
-          <w:numId w:val="1"/>
+          <w:numId w:val="2"/>
         </w:numPr>
         <w:pBdr>
           <w:left w:val="single" w:color="94A3B8" w:sz="18" w:space="8"/>
         </w:pBdr>
         <w:shd w:fill="EEF2F7" w:color="auto" w:val="clear"/>
-        <w:ind w:left="240" w:right="240"/>
+        <w:spacing w:after="60"/>
+        <w:ind w:left="600" w:right="240" w:hanging="360"/>
       </w:pPr>
       <w:r>
         <w:t xml:space="preserve">Diese Vorlage ist ein Ausgangspunkt, keine Rechtsberatung. Passen Sie sie an Ihr Unternehmen an und lassen Sie sie bei Bedarf von einer Fachperson prüfen.</w:t>
@@ -48,13 +50,14 @@
         <w:pStyle w:val="ListParagraph"/>
         <w:numPr>
           <w:ilvl w:val="0"/>
-          <w:numId w:val="1"/>
+          <w:numId w:val="2"/>
         </w:numPr>
         <w:pBdr>
           <w:left w:val="single" w:color="94A3B8" w:sz="18" w:space="8"/>
         </w:pBdr>
         <w:shd w:fill="EEF2F7" w:color="auto" w:val="clear"/>
-        <w:ind w:left="240" w:right="240"/>
+        <w:spacing w:after="60"/>
+        <w:ind w:left="600" w:right="240" w:hanging="360"/>
       </w:pPr>
       <w:r>
         <w:t xml:space="preserve">Ersetzen Sie alle Angaben in </w:t>
@@ -76,13 +79,14 @@
         <w:pStyle w:val="ListParagraph"/>
         <w:numPr>
           <w:ilvl w:val="0"/>
-          <w:numId w:val="1"/>
+          <w:numId w:val="2"/>
         </w:numPr>
         <w:pBdr>
           <w:left w:val="single" w:color="94A3B8" w:sz="18" w:space="8"/>
         </w:pBdr>
         <w:shd w:fill="EEF2F7" w:color="auto" w:val="clear"/>
-        <w:ind w:left="240" w:right="240"/>
+        <w:spacing w:after="60"/>
+        <w:ind w:left="600" w:right="240" w:hanging="360"/>
       </w:pPr>
       <w:r>
         <w:rPr>
@@ -100,13 +104,14 @@
         <w:pStyle w:val="ListParagraph"/>
         <w:numPr>
           <w:ilvl w:val="0"/>
-          <w:numId w:val="1"/>
+          <w:numId w:val="2"/>
         </w:numPr>
         <w:pBdr>
           <w:left w:val="single" w:color="94A3B8" w:sz="18" w:space="8"/>
         </w:pBdr>
         <w:shd w:fill="EEF2F7" w:color="auto" w:val="clear"/>
-        <w:ind w:left="240" w:right="240"/>
+        <w:spacing w:after="60"/>
+        <w:ind w:left="600" w:right="240" w:hanging="360"/>
       </w:pPr>
       <w:r>
         <w:rPr>
@@ -134,13 +139,14 @@
         <w:pStyle w:val="ListParagraph"/>
         <w:numPr>
           <w:ilvl w:val="0"/>
-          <w:numId w:val="1"/>
+          <w:numId w:val="2"/>
         </w:numPr>
         <w:pBdr>
           <w:left w:val="single" w:color="94A3B8" w:sz="18" w:space="8"/>
         </w:pBdr>
         <w:shd w:fill="EEF2F7" w:color="auto" w:val="clear"/>
-        <w:ind w:left="240" w:right="240"/>
+        <w:spacing w:after="60"/>
+        <w:ind w:left="600" w:right="240" w:hanging="360"/>
       </w:pPr>
       <w:r>
         <w:t xml:space="preserve">Die Vorlage passt zum KI-Check auf aicompliant.ch: Sie deckt die Punkte Tool-Freigabe, Daten, Schulung, Transparenz, Entscheide über Personen, Verantwortung und Vorfälle ab.</w:t>
@@ -184,17 +190,27 @@
           <w:insideH w:val="single" w:color="auto" w:sz="4"/>
           <w:insideV w:val="single" w:color="auto" w:sz="4"/>
         </w:tblBorders>
+        <w:tblLayout w:type="fixed"/>
       </w:tblPr>
       <w:tblGrid>
-        <w:gridCol w:w="4513"/>
-        <w:gridCol w:w="4513"/>
+        <w:gridCol w:w="3904"/>
+        <w:gridCol w:w="4402"/>
       </w:tblGrid>
       <w:tr>
         <w:tc>
           <w:tcPr>
-            <w:tcW w:type="pct" w:w="2500"/>
-          </w:tcPr>
-          <w:p>
+            <w:tcW w:type="pct" w:w="2350"/>
+            <w:tcMar>
+              <w:top w:type="dxa" w:w="40"/>
+              <w:left w:type="dxa" w:w="60"/>
+              <w:bottom w:type="dxa" w:w="40"/>
+              <w:right w:type="dxa" w:w="60"/>
+            </w:tcMar>
+          </w:tcPr>
+          <w:p>
+            <w:pPr>
+              <w:spacing w:after="0"/>
+            </w:pPr>
             <w:r>
               <w:t xml:space="preserve">Version</w:t>
             </w:r>
@@ -202,9 +218,18 @@
         </w:tc>
         <w:tc>
           <w:tcPr>
-            <w:tcW w:type="pct" w:w="2500"/>
-          </w:tcPr>
-          <w:p>
+            <w:tcW w:type="pct" w:w="2650"/>
+            <w:tcMar>
+              <w:top w:type="dxa" w:w="40"/>
+              <w:left w:type="dxa" w:w="60"/>
+              <w:bottom w:type="dxa" w:w="40"/>
+              <w:right w:type="dxa" w:w="60"/>
+            </w:tcMar>
+          </w:tcPr>
+          <w:p>
+            <w:pPr>
+              <w:spacing w:after="0"/>
+            </w:pPr>
             <w:r>
               <w:rPr>
                 <w:highlight w:val="yellow"/>
@@ -217,9 +242,18 @@
       <w:tr>
         <w:tc>
           <w:tcPr>
-            <w:tcW w:type="pct" w:w="2500"/>
-          </w:tcPr>
-          <w:p>
+            <w:tcW w:type="pct" w:w="2350"/>
+            <w:tcMar>
+              <w:top w:type="dxa" w:w="40"/>
+              <w:left w:type="dxa" w:w="60"/>
+              <w:bottom w:type="dxa" w:w="40"/>
+              <w:right w:type="dxa" w:w="60"/>
+            </w:tcMar>
+          </w:tcPr>
+          <w:p>
+            <w:pPr>
+              <w:spacing w:after="0"/>
+            </w:pPr>
             <w:r>
               <w:t xml:space="preserve">Gültig ab</w:t>
             </w:r>
@@ -227,9 +261,18 @@
         </w:tc>
         <w:tc>
           <w:tcPr>
-            <w:tcW w:type="pct" w:w="2500"/>
-          </w:tcPr>
-          <w:p>
+            <w:tcW w:type="pct" w:w="2650"/>
+            <w:tcMar>
+              <w:top w:type="dxa" w:w="40"/>
+              <w:left w:type="dxa" w:w="60"/>
+              <w:bottom w:type="dxa" w:w="40"/>
+              <w:right w:type="dxa" w:w="60"/>
+            </w:tcMar>
+          </w:tcPr>
+          <w:p>
+            <w:pPr>
+              <w:spacing w:after="0"/>
+            </w:pPr>
             <w:r>
               <w:rPr>
                 <w:highlight w:val="yellow"/>
@@ -242,9 +285,18 @@
       <w:tr>
         <w:tc>
           <w:tcPr>
-            <w:tcW w:type="pct" w:w="2500"/>
-          </w:tcPr>
-          <w:p>
+            <w:tcW w:type="pct" w:w="2350"/>
+            <w:tcMar>
+              <w:top w:type="dxa" w:w="40"/>
+              <w:left w:type="dxa" w:w="60"/>
+              <w:bottom w:type="dxa" w:w="40"/>
+              <w:right w:type="dxa" w:w="60"/>
+            </w:tcMar>
+          </w:tcPr>
+          <w:p>
+            <w:pPr>
+              <w:spacing w:after="0"/>
+            </w:pPr>
             <w:r>
               <w:t xml:space="preserve">Verantwortlich</w:t>
             </w:r>
@@ -252,9 +304,18 @@
         </w:tc>
         <w:tc>
           <w:tcPr>
-            <w:tcW w:type="pct" w:w="2500"/>
-          </w:tcPr>
-          <w:p>
+            <w:tcW w:type="pct" w:w="2650"/>
+            <w:tcMar>
+              <w:top w:type="dxa" w:w="40"/>
+              <w:left w:type="dxa" w:w="60"/>
+              <w:bottom w:type="dxa" w:w="40"/>
+              <w:right w:type="dxa" w:w="60"/>
+            </w:tcMar>
+          </w:tcPr>
+          <w:p>
+            <w:pPr>
+              <w:spacing w:after="0"/>
+            </w:pPr>
             <w:r>
               <w:rPr>
                 <w:highlight w:val="yellow"/>
@@ -270,9 +331,18 @@
       <w:tr>
         <w:tc>
           <w:tcPr>
-            <w:tcW w:type="pct" w:w="2500"/>
-          </w:tcPr>
-          <w:p>
+            <w:tcW w:type="pct" w:w="2350"/>
+            <w:tcMar>
+              <w:top w:type="dxa" w:w="40"/>
+              <w:left w:type="dxa" w:w="60"/>
+              <w:bottom w:type="dxa" w:w="40"/>
+              <w:right w:type="dxa" w:w="60"/>
+            </w:tcMar>
+          </w:tcPr>
+          <w:p>
+            <w:pPr>
+              <w:spacing w:after="0"/>
+            </w:pPr>
             <w:r>
               <w:t xml:space="preserve">Genehmigt durch</w:t>
             </w:r>
@@ -280,9 +350,18 @@
         </w:tc>
         <w:tc>
           <w:tcPr>
-            <w:tcW w:type="pct" w:w="2500"/>
-          </w:tcPr>
-          <w:p>
+            <w:tcW w:type="pct" w:w="2650"/>
+            <w:tcMar>
+              <w:top w:type="dxa" w:w="40"/>
+              <w:left w:type="dxa" w:w="60"/>
+              <w:bottom w:type="dxa" w:w="40"/>
+              <w:right w:type="dxa" w:w="60"/>
+            </w:tcMar>
+          </w:tcPr>
+          <w:p>
+            <w:pPr>
+              <w:spacing w:after="0"/>
+            </w:pPr>
             <w:r>
               <w:rPr>
                 <w:highlight w:val="yellow"/>
@@ -295,9 +374,18 @@
       <w:tr>
         <w:tc>
           <w:tcPr>
-            <w:tcW w:type="pct" w:w="2500"/>
-          </w:tcPr>
-          <w:p>
+            <w:tcW w:type="pct" w:w="2350"/>
+            <w:tcMar>
+              <w:top w:type="dxa" w:w="40"/>
+              <w:left w:type="dxa" w:w="60"/>
+              <w:bottom w:type="dxa" w:w="40"/>
+              <w:right w:type="dxa" w:w="60"/>
+            </w:tcMar>
+          </w:tcPr>
+          <w:p>
+            <w:pPr>
+              <w:spacing w:after="0"/>
+            </w:pPr>
             <w:r>
               <w:t xml:space="preserve">Nächste Überprüfung</w:t>
             </w:r>
@@ -305,9 +393,18 @@
         </w:tc>
         <w:tc>
           <w:tcPr>
-            <w:tcW w:type="pct" w:w="2500"/>
-          </w:tcPr>
-          <w:p>
+            <w:tcW w:type="pct" w:w="2650"/>
+            <w:tcMar>
+              <w:top w:type="dxa" w:w="40"/>
+              <w:left w:type="dxa" w:w="60"/>
+              <w:bottom w:type="dxa" w:w="40"/>
+              <w:right w:type="dxa" w:w="60"/>
+            </w:tcMar>
+          </w:tcPr>
+          <w:p>
+            <w:pPr>
+              <w:spacing w:after="0"/>
+            </w:pPr>
             <w:r>
               <w:rPr>
                 <w:highlight w:val="yellow"/>
@@ -322,6 +419,7 @@
     <w:p>
       <w:pPr>
         <w:pStyle w:val="Heading1"/>
+        <w:keepNext/>
       </w:pPr>
       <w:r>
         <w:t xml:space="preserve">1. Zweck und Geltungsbereich</w:t>
@@ -351,8 +449,10 @@
         <w:pStyle w:val="ListParagraph"/>
         <w:numPr>
           <w:ilvl w:val="0"/>
-          <w:numId w:val="1"/>
+          <w:numId w:val="3"/>
         </w:numPr>
+        <w:spacing w:after="60"/>
+        <w:ind w:left="360" w:hanging="360"/>
       </w:pPr>
       <w:r>
         <w:t xml:space="preserve">alle Mitarbeitenden, Lernenden, Praktikantinnen und Praktikanten sowie </w:t>
@@ -372,8 +472,10 @@
         <w:pStyle w:val="ListParagraph"/>
         <w:numPr>
           <w:ilvl w:val="0"/>
-          <w:numId w:val="1"/>
+          <w:numId w:val="3"/>
         </w:numPr>
+        <w:spacing w:after="60"/>
+        <w:ind w:left="360" w:hanging="360"/>
       </w:pPr>
       <w:r>
         <w:t xml:space="preserve">alle KI-Werkzeuge, die Texte, Bilder, Audio, Code oder Analysen erzeugen, inklusive KI-Funktionen in bestehender Software (z. B. in Office-Programmen, im CRM oder in der Buchhaltungssoftware);</w:t>
@@ -384,8 +486,10 @@
         <w:pStyle w:val="ListParagraph"/>
         <w:numPr>
           <w:ilvl w:val="0"/>
-          <w:numId w:val="1"/>
+          <w:numId w:val="3"/>
         </w:numPr>
+        <w:spacing w:after="60"/>
+        <w:ind w:left="360" w:hanging="360"/>
       </w:pPr>
       <w:r>
         <w:t xml:space="preserve">die Nutzung auf Firmengeräten und auf privaten Geräten, sofern es um Arbeit für </w:t>
@@ -403,6 +507,7 @@
     <w:p>
       <w:pPr>
         <w:pStyle w:val="Heading1"/>
+        <w:keepNext/>
       </w:pPr>
       <w:r>
         <w:t xml:space="preserve">2. Grundsätze</w:t>
@@ -413,8 +518,10 @@
         <w:pStyle w:val="ListParagraph"/>
         <w:numPr>
           <w:ilvl w:val="0"/>
-          <w:numId w:val="2"/>
+          <w:numId w:val="4"/>
         </w:numPr>
+        <w:spacing w:after="60"/>
+        <w:ind w:left="360" w:hanging="360"/>
       </w:pPr>
       <w:r>
         <w:rPr>
@@ -432,8 +539,10 @@
         <w:pStyle w:val="ListParagraph"/>
         <w:numPr>
           <w:ilvl w:val="0"/>
-          <w:numId w:val="2"/>
+          <w:numId w:val="4"/>
         </w:numPr>
+        <w:spacing w:after="60"/>
+        <w:ind w:left="360" w:hanging="360"/>
       </w:pPr>
       <w:r>
         <w:rPr>
@@ -451,8 +560,10 @@
         <w:pStyle w:val="ListParagraph"/>
         <w:numPr>
           <w:ilvl w:val="0"/>
-          <w:numId w:val="2"/>
+          <w:numId w:val="4"/>
         </w:numPr>
+        <w:spacing w:after="60"/>
+        <w:ind w:left="360" w:hanging="360"/>
       </w:pPr>
       <w:r>
         <w:rPr>
@@ -470,8 +581,10 @@
         <w:pStyle w:val="ListParagraph"/>
         <w:numPr>
           <w:ilvl w:val="0"/>
-          <w:numId w:val="2"/>
+          <w:numId w:val="4"/>
         </w:numPr>
+        <w:spacing w:after="60"/>
+        <w:ind w:left="360" w:hanging="360"/>
       </w:pPr>
       <w:r>
         <w:rPr>
@@ -489,8 +602,10 @@
         <w:pStyle w:val="ListParagraph"/>
         <w:numPr>
           <w:ilvl w:val="0"/>
-          <w:numId w:val="2"/>
+          <w:numId w:val="4"/>
         </w:numPr>
+        <w:spacing w:after="60"/>
+        <w:ind w:left="360" w:hanging="360"/>
       </w:pPr>
       <w:r>
         <w:rPr>
@@ -506,6 +621,7 @@
     <w:p>
       <w:pPr>
         <w:pStyle w:val="Heading1"/>
+        <w:keepNext/>
       </w:pPr>
       <w:r>
         <w:t xml:space="preserve">3. Freigegebene KI-Tools</w:t>
@@ -527,12 +643,13 @@
           <w:insideH w:val="single" w:color="auto" w:sz="4"/>
           <w:insideV w:val="single" w:color="auto" w:sz="4"/>
         </w:tblBorders>
+        <w:tblLayout w:type="fixed"/>
       </w:tblPr>
       <w:tblGrid>
-        <w:gridCol w:w="2257"/>
-        <w:gridCol w:w="2257"/>
-        <w:gridCol w:w="2257"/>
-        <w:gridCol w:w="2257"/>
+        <w:gridCol w:w="1578"/>
+        <w:gridCol w:w="2326"/>
+        <w:gridCol w:w="2741"/>
+        <w:gridCol w:w="1744"/>
       </w:tblGrid>
       <w:tr>
         <w:trPr>
@@ -540,10 +657,19 @@
         </w:trPr>
         <w:tc>
           <w:tcPr>
-            <w:tcW w:type="pct" w:w="1250"/>
+            <w:tcW w:type="pct" w:w="950"/>
             <w:shd w:fill="EEF2F7" w:color="auto" w:val="clear"/>
-          </w:tcPr>
-          <w:p>
+            <w:tcMar>
+              <w:top w:type="dxa" w:w="40"/>
+              <w:left w:type="dxa" w:w="60"/>
+              <w:bottom w:type="dxa" w:w="40"/>
+              <w:right w:type="dxa" w:w="60"/>
+            </w:tcMar>
+          </w:tcPr>
+          <w:p>
+            <w:pPr>
+              <w:spacing w:after="0"/>
+            </w:pPr>
             <w:r>
               <w:rPr>
                 <w:b/>
@@ -555,10 +681,19 @@
         </w:tc>
         <w:tc>
           <w:tcPr>
-            <w:tcW w:type="pct" w:w="1250"/>
+            <w:tcW w:type="pct" w:w="1400"/>
             <w:shd w:fill="EEF2F7" w:color="auto" w:val="clear"/>
-          </w:tcPr>
-          <w:p>
+            <w:tcMar>
+              <w:top w:type="dxa" w:w="40"/>
+              <w:left w:type="dxa" w:w="60"/>
+              <w:bottom w:type="dxa" w:w="40"/>
+              <w:right w:type="dxa" w:w="60"/>
+            </w:tcMar>
+          </w:tcPr>
+          <w:p>
+            <w:pPr>
+              <w:spacing w:after="0"/>
+            </w:pPr>
             <w:r>
               <w:rPr>
                 <w:b/>
@@ -570,10 +705,19 @@
         </w:tc>
         <w:tc>
           <w:tcPr>
-            <w:tcW w:type="pct" w:w="1250"/>
+            <w:tcW w:type="pct" w:w="1650"/>
             <w:shd w:fill="EEF2F7" w:color="auto" w:val="clear"/>
-          </w:tcPr>
-          <w:p>
+            <w:tcMar>
+              <w:top w:type="dxa" w:w="40"/>
+              <w:left w:type="dxa" w:w="60"/>
+              <w:bottom w:type="dxa" w:w="40"/>
+              <w:right w:type="dxa" w:w="60"/>
+            </w:tcMar>
+          </w:tcPr>
+          <w:p>
+            <w:pPr>
+              <w:spacing w:after="0"/>
+            </w:pPr>
             <w:r>
               <w:rPr>
                 <w:b/>
@@ -585,10 +729,19 @@
         </w:tc>
         <w:tc>
           <w:tcPr>
-            <w:tcW w:type="pct" w:w="1250"/>
+            <w:tcW w:type="pct" w:w="1050"/>
             <w:shd w:fill="EEF2F7" w:color="auto" w:val="clear"/>
-          </w:tcPr>
-          <w:p>
+            <w:tcMar>
+              <w:top w:type="dxa" w:w="40"/>
+              <w:left w:type="dxa" w:w="60"/>
+              <w:bottom w:type="dxa" w:w="40"/>
+              <w:right w:type="dxa" w:w="60"/>
+            </w:tcMar>
+          </w:tcPr>
+          <w:p>
+            <w:pPr>
+              <w:spacing w:after="0"/>
+            </w:pPr>
             <w:r>
               <w:rPr>
                 <w:b/>
@@ -602,9 +755,18 @@
       <w:tr>
         <w:tc>
           <w:tcPr>
-            <w:tcW w:type="pct" w:w="1250"/>
-          </w:tcPr>
-          <w:p>
+            <w:tcW w:type="pct" w:w="950"/>
+            <w:tcMar>
+              <w:top w:type="dxa" w:w="40"/>
+              <w:left w:type="dxa" w:w="60"/>
+              <w:bottom w:type="dxa" w:w="40"/>
+              <w:right w:type="dxa" w:w="60"/>
+            </w:tcMar>
+          </w:tcPr>
+          <w:p>
+            <w:pPr>
+              <w:spacing w:after="0"/>
+            </w:pPr>
             <w:r>
               <w:rPr>
                 <w:highlight w:val="yellow"/>
@@ -615,9 +777,18 @@
         </w:tc>
         <w:tc>
           <w:tcPr>
-            <w:tcW w:type="pct" w:w="1250"/>
-          </w:tcPr>
-          <w:p>
+            <w:tcW w:type="pct" w:w="1400"/>
+            <w:tcMar>
+              <w:top w:type="dxa" w:w="40"/>
+              <w:left w:type="dxa" w:w="60"/>
+              <w:bottom w:type="dxa" w:w="40"/>
+              <w:right w:type="dxa" w:w="60"/>
+            </w:tcMar>
+          </w:tcPr>
+          <w:p>
+            <w:pPr>
+              <w:spacing w:after="0"/>
+            </w:pPr>
             <w:r>
               <w:rPr>
                 <w:highlight w:val="yellow"/>
@@ -628,9 +799,18 @@
         </w:tc>
         <w:tc>
           <w:tcPr>
-            <w:tcW w:type="pct" w:w="1250"/>
-          </w:tcPr>
-          <w:p>
+            <w:tcW w:type="pct" w:w="1650"/>
+            <w:tcMar>
+              <w:top w:type="dxa" w:w="40"/>
+              <w:left w:type="dxa" w:w="60"/>
+              <w:bottom w:type="dxa" w:w="40"/>
+              <w:right w:type="dxa" w:w="60"/>
+            </w:tcMar>
+          </w:tcPr>
+          <w:p>
+            <w:pPr>
+              <w:spacing w:after="0"/>
+            </w:pPr>
             <w:r>
               <w:rPr>
                 <w:highlight w:val="yellow"/>
@@ -641,9 +821,18 @@
         </w:tc>
         <w:tc>
           <w:tcPr>
-            <w:tcW w:type="pct" w:w="1250"/>
-          </w:tcPr>
-          <w:p>
+            <w:tcW w:type="pct" w:w="1050"/>
+            <w:tcMar>
+              <w:top w:type="dxa" w:w="40"/>
+              <w:left w:type="dxa" w:w="60"/>
+              <w:bottom w:type="dxa" w:w="40"/>
+              <w:right w:type="dxa" w:w="60"/>
+            </w:tcMar>
+          </w:tcPr>
+          <w:p>
+            <w:pPr>
+              <w:spacing w:after="0"/>
+            </w:pPr>
             <w:r>
               <w:rPr>
                 <w:highlight w:val="yellow"/>
@@ -656,9 +845,18 @@
       <w:tr>
         <w:tc>
           <w:tcPr>
-            <w:tcW w:type="pct" w:w="1250"/>
-          </w:tcPr>
-          <w:p>
+            <w:tcW w:type="pct" w:w="950"/>
+            <w:tcMar>
+              <w:top w:type="dxa" w:w="40"/>
+              <w:left w:type="dxa" w:w="60"/>
+              <w:bottom w:type="dxa" w:w="40"/>
+              <w:right w:type="dxa" w:w="60"/>
+            </w:tcMar>
+          </w:tcPr>
+          <w:p>
+            <w:pPr>
+              <w:spacing w:after="0"/>
+            </w:pPr>
             <w:r>
               <w:rPr>
                 <w:highlight w:val="yellow"/>
@@ -669,9 +867,18 @@
         </w:tc>
         <w:tc>
           <w:tcPr>
-            <w:tcW w:type="pct" w:w="1250"/>
-          </w:tcPr>
-          <w:p>
+            <w:tcW w:type="pct" w:w="1400"/>
+            <w:tcMar>
+              <w:top w:type="dxa" w:w="40"/>
+              <w:left w:type="dxa" w:w="60"/>
+              <w:bottom w:type="dxa" w:w="40"/>
+              <w:right w:type="dxa" w:w="60"/>
+            </w:tcMar>
+          </w:tcPr>
+          <w:p>
+            <w:pPr>
+              <w:spacing w:after="0"/>
+            </w:pPr>
             <w:r>
               <w:rPr>
                 <w:highlight w:val="yellow"/>
@@ -682,9 +889,18 @@
         </w:tc>
         <w:tc>
           <w:tcPr>
-            <w:tcW w:type="pct" w:w="1250"/>
-          </w:tcPr>
-          <w:p>
+            <w:tcW w:type="pct" w:w="1650"/>
+            <w:tcMar>
+              <w:top w:type="dxa" w:w="40"/>
+              <w:left w:type="dxa" w:w="60"/>
+              <w:bottom w:type="dxa" w:w="40"/>
+              <w:right w:type="dxa" w:w="60"/>
+            </w:tcMar>
+          </w:tcPr>
+          <w:p>
+            <w:pPr>
+              <w:spacing w:after="0"/>
+            </w:pPr>
             <w:r>
               <w:rPr>
                 <w:highlight w:val="yellow"/>
@@ -695,9 +911,18 @@
         </w:tc>
         <w:tc>
           <w:tcPr>
-            <w:tcW w:type="pct" w:w="1250"/>
-          </w:tcPr>
-          <w:p>
+            <w:tcW w:type="pct" w:w="1050"/>
+            <w:tcMar>
+              <w:top w:type="dxa" w:w="40"/>
+              <w:left w:type="dxa" w:w="60"/>
+              <w:bottom w:type="dxa" w:w="40"/>
+              <w:right w:type="dxa" w:w="60"/>
+            </w:tcMar>
+          </w:tcPr>
+          <w:p>
+            <w:pPr>
+              <w:spacing w:after="0"/>
+            </w:pPr>
             <w:r>
               <w:rPr>
                 <w:highlight w:val="yellow"/>
@@ -710,9 +935,18 @@
       <w:tr>
         <w:tc>
           <w:tcPr>
-            <w:tcW w:type="pct" w:w="1250"/>
-          </w:tcPr>
-          <w:p>
+            <w:tcW w:type="pct" w:w="950"/>
+            <w:tcMar>
+              <w:top w:type="dxa" w:w="40"/>
+              <w:left w:type="dxa" w:w="60"/>
+              <w:bottom w:type="dxa" w:w="40"/>
+              <w:right w:type="dxa" w:w="60"/>
+            </w:tcMar>
+          </w:tcPr>
+          <w:p>
+            <w:pPr>
+              <w:spacing w:after="0"/>
+            </w:pPr>
             <w:r>
               <w:rPr>
                 <w:highlight w:val="yellow"/>
@@ -723,9 +957,18 @@
         </w:tc>
         <w:tc>
           <w:tcPr>
-            <w:tcW w:type="pct" w:w="1250"/>
-          </w:tcPr>
-          <w:p>
+            <w:tcW w:type="pct" w:w="1400"/>
+            <w:tcMar>
+              <w:top w:type="dxa" w:w="40"/>
+              <w:left w:type="dxa" w:w="60"/>
+              <w:bottom w:type="dxa" w:w="40"/>
+              <w:right w:type="dxa" w:w="60"/>
+            </w:tcMar>
+          </w:tcPr>
+          <w:p>
+            <w:pPr>
+              <w:spacing w:after="0"/>
+            </w:pPr>
             <w:r>
               <w:rPr>
                 <w:highlight w:val="yellow"/>
@@ -736,9 +979,18 @@
         </w:tc>
         <w:tc>
           <w:tcPr>
-            <w:tcW w:type="pct" w:w="1250"/>
-          </w:tcPr>
-          <w:p>
+            <w:tcW w:type="pct" w:w="1650"/>
+            <w:tcMar>
+              <w:top w:type="dxa" w:w="40"/>
+              <w:left w:type="dxa" w:w="60"/>
+              <w:bottom w:type="dxa" w:w="40"/>
+              <w:right w:type="dxa" w:w="60"/>
+            </w:tcMar>
+          </w:tcPr>
+          <w:p>
+            <w:pPr>
+              <w:spacing w:after="0"/>
+            </w:pPr>
             <w:r>
               <w:rPr>
                 <w:highlight w:val="yellow"/>
@@ -749,9 +1001,18 @@
         </w:tc>
         <w:tc>
           <w:tcPr>
-            <w:tcW w:type="pct" w:w="1250"/>
-          </w:tcPr>
-          <w:p>
+            <w:tcW w:type="pct" w:w="1050"/>
+            <w:tcMar>
+              <w:top w:type="dxa" w:w="40"/>
+              <w:left w:type="dxa" w:w="60"/>
+              <w:bottom w:type="dxa" w:w="40"/>
+              <w:right w:type="dxa" w:w="60"/>
+            </w:tcMar>
+          </w:tcPr>
+          <w:p>
+            <w:pPr>
+              <w:spacing w:after="0"/>
+            </w:pPr>
             <w:r>
               <w:rPr>
                 <w:highlight w:val="yellow"/>
@@ -780,8 +1041,10 @@
         <w:pStyle w:val="ListParagraph"/>
         <w:numPr>
           <w:ilvl w:val="0"/>
-          <w:numId w:val="1"/>
+          <w:numId w:val="5"/>
         </w:numPr>
+        <w:spacing w:after="60"/>
+        <w:ind w:left="360" w:hanging="360"/>
       </w:pPr>
       <w:r>
         <w:t xml:space="preserve">ob ein Business-Konto mit Auftragsbearbeitungsvertrag (Data Processing Agreement) verfügbar ist;</w:t>
@@ -792,8 +1055,10 @@
         <w:pStyle w:val="ListParagraph"/>
         <w:numPr>
           <w:ilvl w:val="0"/>
-          <w:numId w:val="1"/>
+          <w:numId w:val="5"/>
         </w:numPr>
+        <w:spacing w:after="60"/>
+        <w:ind w:left="360" w:hanging="360"/>
       </w:pPr>
       <w:r>
         <w:t xml:space="preserve">ob die Nutzung unserer Daten für das Training des Anbieters ausgeschlossen ist;</w:t>
@@ -804,8 +1069,10 @@
         <w:pStyle w:val="ListParagraph"/>
         <w:numPr>
           <w:ilvl w:val="0"/>
-          <w:numId w:val="1"/>
+          <w:numId w:val="5"/>
         </w:numPr>
+        <w:spacing w:after="60"/>
+        <w:ind w:left="360" w:hanging="360"/>
       </w:pPr>
       <w:r>
         <w:t xml:space="preserve">wo die Daten bearbeitet und gespeichert werden und ob die Bekanntgabe ins Ausland zulässig ist (Art. 16–17 DSG);</w:t>
@@ -816,8 +1083,10 @@
         <w:pStyle w:val="ListParagraph"/>
         <w:numPr>
           <w:ilvl w:val="0"/>
-          <w:numId w:val="1"/>
+          <w:numId w:val="5"/>
         </w:numPr>
+        <w:spacing w:after="60"/>
+        <w:ind w:left="360" w:hanging="360"/>
       </w:pPr>
       <w:r>
         <w:t xml:space="preserve">welche Datenstufe im Tool erlaubt sein soll.</w:t>
@@ -850,6 +1119,7 @@
     <w:p>
       <w:pPr>
         <w:pStyle w:val="Heading1"/>
+        <w:keepNext/>
       </w:pPr>
       <w:r>
         <w:t xml:space="preserve">4. Welche Daten in KI-Tools dürfen</w:t>
@@ -866,11 +1136,12 @@
           <w:insideH w:val="single" w:color="auto" w:sz="4"/>
           <w:insideV w:val="single" w:color="auto" w:sz="4"/>
         </w:tblBorders>
+        <w:tblLayout w:type="fixed"/>
       </w:tblPr>
       <w:tblGrid>
-        <w:gridCol w:w="2979"/>
-        <w:gridCol w:w="2979"/>
-        <w:gridCol w:w="2979"/>
+        <w:gridCol w:w="1661"/>
+        <w:gridCol w:w="4236"/>
+        <w:gridCol w:w="2492"/>
       </w:tblGrid>
       <w:tr>
         <w:trPr>
@@ -878,10 +1149,19 @@
         </w:trPr>
         <w:tc>
           <w:tcPr>
-            <w:tcW w:type="pct" w:w="1650"/>
+            <w:tcW w:type="pct" w:w="1000"/>
             <w:shd w:fill="EEF2F7" w:color="auto" w:val="clear"/>
-          </w:tcPr>
-          <w:p>
+            <w:tcMar>
+              <w:top w:type="dxa" w:w="40"/>
+              <w:left w:type="dxa" w:w="60"/>
+              <w:bottom w:type="dxa" w:w="40"/>
+              <w:right w:type="dxa" w:w="60"/>
+            </w:tcMar>
+          </w:tcPr>
+          <w:p>
+            <w:pPr>
+              <w:spacing w:after="0"/>
+            </w:pPr>
             <w:r>
               <w:rPr>
                 <w:b/>
@@ -893,10 +1173,19 @@
         </w:tc>
         <w:tc>
           <w:tcPr>
-            <w:tcW w:type="pct" w:w="1650"/>
+            <w:tcW w:type="pct" w:w="2550"/>
             <w:shd w:fill="EEF2F7" w:color="auto" w:val="clear"/>
-          </w:tcPr>
-          <w:p>
+            <w:tcMar>
+              <w:top w:type="dxa" w:w="40"/>
+              <w:left w:type="dxa" w:w="60"/>
+              <w:bottom w:type="dxa" w:w="40"/>
+              <w:right w:type="dxa" w:w="60"/>
+            </w:tcMar>
+          </w:tcPr>
+          <w:p>
+            <w:pPr>
+              <w:spacing w:after="0"/>
+            </w:pPr>
             <w:r>
               <w:rPr>
                 <w:b/>
@@ -908,10 +1197,19 @@
         </w:tc>
         <w:tc>
           <w:tcPr>
-            <w:tcW w:type="pct" w:w="1650"/>
+            <w:tcW w:type="pct" w:w="1500"/>
             <w:shd w:fill="EEF2F7" w:color="auto" w:val="clear"/>
-          </w:tcPr>
-          <w:p>
+            <w:tcMar>
+              <w:top w:type="dxa" w:w="40"/>
+              <w:left w:type="dxa" w:w="60"/>
+              <w:bottom w:type="dxa" w:w="40"/>
+              <w:right w:type="dxa" w:w="60"/>
+            </w:tcMar>
+          </w:tcPr>
+          <w:p>
+            <w:pPr>
+              <w:spacing w:after="0"/>
+            </w:pPr>
             <w:r>
               <w:rPr>
                 <w:b/>
@@ -925,9 +1223,18 @@
       <w:tr>
         <w:tc>
           <w:tcPr>
-            <w:tcW w:type="pct" w:w="1650"/>
-          </w:tcPr>
-          <w:p>
+            <w:tcW w:type="pct" w:w="1000"/>
+            <w:tcMar>
+              <w:top w:type="dxa" w:w="40"/>
+              <w:left w:type="dxa" w:w="60"/>
+              <w:bottom w:type="dxa" w:w="40"/>
+              <w:right w:type="dxa" w:w="60"/>
+            </w:tcMar>
+          </w:tcPr>
+          <w:p>
+            <w:pPr>
+              <w:spacing w:after="0"/>
+            </w:pPr>
             <w:r>
               <w:t xml:space="preserve">🟢 </w:t>
             </w:r>
@@ -945,9 +1252,18 @@
         </w:tc>
         <w:tc>
           <w:tcPr>
-            <w:tcW w:type="pct" w:w="1650"/>
-          </w:tcPr>
-          <w:p>
+            <w:tcW w:type="pct" w:w="2550"/>
+            <w:tcMar>
+              <w:top w:type="dxa" w:w="40"/>
+              <w:left w:type="dxa" w:w="60"/>
+              <w:bottom w:type="dxa" w:w="40"/>
+              <w:right w:type="dxa" w:w="60"/>
+            </w:tcMar>
+          </w:tcPr>
+          <w:p>
+            <w:pPr>
+              <w:spacing w:after="0"/>
+            </w:pPr>
             <w:r>
               <w:t xml:space="preserve">Öffentlich verfügbare Informationen, allgemeine Fragen, eigene Texte ohne vertrauliche Inhalte</w:t>
             </w:r>
@@ -955,9 +1271,18 @@
         </w:tc>
         <w:tc>
           <w:tcPr>
-            <w:tcW w:type="pct" w:w="1650"/>
-          </w:tcPr>
-          <w:p>
+            <w:tcW w:type="pct" w:w="1500"/>
+            <w:tcMar>
+              <w:top w:type="dxa" w:w="40"/>
+              <w:left w:type="dxa" w:w="60"/>
+              <w:bottom w:type="dxa" w:w="40"/>
+              <w:right w:type="dxa" w:w="60"/>
+            </w:tcMar>
+          </w:tcPr>
+          <w:p>
+            <w:pPr>
+              <w:spacing w:after="0"/>
+            </w:pPr>
             <w:r>
               <w:t xml:space="preserve">In allen freigegebenen Tools erlaubt.</w:t>
             </w:r>
@@ -967,9 +1292,18 @@
       <w:tr>
         <w:tc>
           <w:tcPr>
-            <w:tcW w:type="pct" w:w="1650"/>
-          </w:tcPr>
-          <w:p>
+            <w:tcW w:type="pct" w:w="1000"/>
+            <w:tcMar>
+              <w:top w:type="dxa" w:w="40"/>
+              <w:left w:type="dxa" w:w="60"/>
+              <w:bottom w:type="dxa" w:w="40"/>
+              <w:right w:type="dxa" w:w="60"/>
+            </w:tcMar>
+          </w:tcPr>
+          <w:p>
+            <w:pPr>
+              <w:spacing w:after="0"/>
+            </w:pPr>
             <w:r>
               <w:t xml:space="preserve">🟡 </w:t>
             </w:r>
@@ -987,9 +1321,18 @@
         </w:tc>
         <w:tc>
           <w:tcPr>
-            <w:tcW w:type="pct" w:w="1650"/>
-          </w:tcPr>
-          <w:p>
+            <w:tcW w:type="pct" w:w="2550"/>
+            <w:tcMar>
+              <w:top w:type="dxa" w:w="40"/>
+              <w:left w:type="dxa" w:w="60"/>
+              <w:bottom w:type="dxa" w:w="40"/>
+              <w:right w:type="dxa" w:w="60"/>
+            </w:tcMar>
+          </w:tcPr>
+          <w:p>
+            <w:pPr>
+              <w:spacing w:after="0"/>
+            </w:pPr>
             <w:r>
               <w:t xml:space="preserve">Interne Dokumente, Offerten, Namen und Kontaktdaten von Kundschaft oder Mitarbeitenden, Kundenkorrespondenz</w:t>
             </w:r>
@@ -997,9 +1340,18 @@
         </w:tc>
         <w:tc>
           <w:tcPr>
-            <w:tcW w:type="pct" w:w="1650"/>
-          </w:tcPr>
-          <w:p>
+            <w:tcW w:type="pct" w:w="1500"/>
+            <w:tcMar>
+              <w:top w:type="dxa" w:w="40"/>
+              <w:left w:type="dxa" w:w="60"/>
+              <w:bottom w:type="dxa" w:w="40"/>
+              <w:right w:type="dxa" w:w="60"/>
+            </w:tcMar>
+          </w:tcPr>
+          <w:p>
+            <w:pPr>
+              <w:spacing w:after="0"/>
+            </w:pPr>
             <w:r>
               <w:t xml:space="preserve">Nur in Tools, die in Abschnitt 3 für «Gelb» freigegeben sind. Nur so viele Daten wie nötig; wo möglich anonymisieren oder Namen weglassen.</w:t>
             </w:r>
@@ -1009,9 +1361,18 @@
       <w:tr>
         <w:tc>
           <w:tcPr>
-            <w:tcW w:type="pct" w:w="1650"/>
-          </w:tcPr>
-          <w:p>
+            <w:tcW w:type="pct" w:w="1000"/>
+            <w:tcMar>
+              <w:top w:type="dxa" w:w="40"/>
+              <w:left w:type="dxa" w:w="60"/>
+              <w:bottom w:type="dxa" w:w="40"/>
+              <w:right w:type="dxa" w:w="60"/>
+            </w:tcMar>
+          </w:tcPr>
+          <w:p>
+            <w:pPr>
+              <w:spacing w:after="0"/>
+            </w:pPr>
             <w:r>
               <w:t xml:space="preserve">🔴 </w:t>
             </w:r>
@@ -1029,9 +1390,18 @@
         </w:tc>
         <w:tc>
           <w:tcPr>
-            <w:tcW w:type="pct" w:w="1650"/>
-          </w:tcPr>
-          <w:p>
+            <w:tcW w:type="pct" w:w="2550"/>
+            <w:tcMar>
+              <w:top w:type="dxa" w:w="40"/>
+              <w:left w:type="dxa" w:w="60"/>
+              <w:bottom w:type="dxa" w:w="40"/>
+              <w:right w:type="dxa" w:w="60"/>
+            </w:tcMar>
+          </w:tcPr>
+          <w:p>
+            <w:pPr>
+              <w:spacing w:after="0"/>
+            </w:pPr>
             <w:r>
               <w:t xml:space="preserve">Gesundheitsdaten, Angaben zu Religion, Politik, Strafverfahren oder Sozialhilfe (besonders schützenswerte Personendaten, Art. 5 lit. c DSG); Daten unter Berufsgeheimnis; Geschäftsgeheimnisse von Kundschaft; Passwörter, Zugangsdaten, Bank- und Kartendaten</w:t>
             </w:r>
@@ -1039,9 +1409,18 @@
         </w:tc>
         <w:tc>
           <w:tcPr>
-            <w:tcW w:type="pct" w:w="1650"/>
-          </w:tcPr>
-          <w:p>
+            <w:tcW w:type="pct" w:w="1500"/>
+            <w:tcMar>
+              <w:top w:type="dxa" w:w="40"/>
+              <w:left w:type="dxa" w:w="60"/>
+              <w:bottom w:type="dxa" w:w="40"/>
+              <w:right w:type="dxa" w:w="60"/>
+            </w:tcMar>
+          </w:tcPr>
+          <w:p>
+            <w:pPr>
+              <w:spacing w:after="0"/>
+            </w:pPr>
             <w:r>
               <w:rPr>
                 <w:b/>
@@ -1065,6 +1444,7 @@
     <w:p>
       <w:pPr>
         <w:pStyle w:val="Heading1"/>
+        <w:keepNext/>
       </w:pPr>
       <w:r>
         <w:t xml:space="preserve">5. Umgang mit KI-Ergebnissen</w:t>
@@ -1075,8 +1455,10 @@
         <w:pStyle w:val="ListParagraph"/>
         <w:numPr>
           <w:ilvl w:val="0"/>
-          <w:numId w:val="3"/>
+          <w:numId w:val="6"/>
         </w:numPr>
+        <w:spacing w:after="60"/>
+        <w:ind w:left="360" w:hanging="360"/>
       </w:pPr>
       <w:r>
         <w:rPr>
@@ -1094,8 +1476,10 @@
         <w:pStyle w:val="ListParagraph"/>
         <w:numPr>
           <w:ilvl w:val="0"/>
-          <w:numId w:val="3"/>
+          <w:numId w:val="6"/>
         </w:numPr>
+        <w:spacing w:after="60"/>
+        <w:ind w:left="360" w:hanging="360"/>
       </w:pPr>
       <w:r>
         <w:rPr>
@@ -1113,8 +1497,10 @@
         <w:pStyle w:val="ListParagraph"/>
         <w:numPr>
           <w:ilvl w:val="0"/>
-          <w:numId w:val="3"/>
+          <w:numId w:val="6"/>
         </w:numPr>
+        <w:spacing w:after="60"/>
+        <w:ind w:left="360" w:hanging="360"/>
       </w:pPr>
       <w:r>
         <w:rPr>
@@ -1132,8 +1518,10 @@
         <w:pStyle w:val="ListParagraph"/>
         <w:numPr>
           <w:ilvl w:val="0"/>
-          <w:numId w:val="3"/>
+          <w:numId w:val="6"/>
         </w:numPr>
+        <w:spacing w:after="60"/>
+        <w:ind w:left="360" w:hanging="360"/>
       </w:pPr>
       <w:r>
         <w:rPr>
@@ -1160,8 +1548,10 @@
         <w:pStyle w:val="ListParagraph"/>
         <w:numPr>
           <w:ilvl w:val="0"/>
-          <w:numId w:val="3"/>
+          <w:numId w:val="6"/>
         </w:numPr>
+        <w:spacing w:after="60"/>
+        <w:ind w:left="360" w:hanging="360"/>
       </w:pPr>
       <w:r>
         <w:rPr>
@@ -1179,8 +1569,10 @@
         <w:pStyle w:val="ListParagraph"/>
         <w:numPr>
           <w:ilvl w:val="0"/>
-          <w:numId w:val="3"/>
+          <w:numId w:val="6"/>
         </w:numPr>
+        <w:spacing w:after="60"/>
+        <w:ind w:left="360" w:hanging="360"/>
       </w:pPr>
       <w:r>
         <w:rPr>
@@ -1196,6 +1588,7 @@
     <w:p>
       <w:pPr>
         <w:pStyle w:val="Heading1"/>
+        <w:keepNext/>
       </w:pPr>
       <w:r>
         <w:t xml:space="preserve">6. Transparenz gegenüber Dritten</w:t>
@@ -1206,8 +1599,10 @@
         <w:pStyle w:val="ListParagraph"/>
         <w:numPr>
           <w:ilvl w:val="0"/>
-          <w:numId w:val="1"/>
+          <w:numId w:val="7"/>
         </w:numPr>
+        <w:spacing w:after="60"/>
+        <w:ind w:left="360" w:hanging="360"/>
       </w:pPr>
       <w:r>
         <w:t xml:space="preserve">Chatbots und andere KI-Systeme, mit denen Kundschaft oder Bewerbende direkt interagieren, sind klar als KI erkennbar.</w:t>
@@ -1218,8 +1613,10 @@
         <w:pStyle w:val="ListParagraph"/>
         <w:numPr>
           <w:ilvl w:val="0"/>
-          <w:numId w:val="1"/>
+          <w:numId w:val="7"/>
         </w:numPr>
+        <w:spacing w:after="60"/>
+        <w:ind w:left="360" w:hanging="360"/>
       </w:pPr>
       <w:r>
         <w:t xml:space="preserve">Die KI-verantwortliche Person sorgt dafür, dass die Datenschutzerklärung die KI-Tools nennt, mit denen Personendaten bearbeitet werden, und den Zweck der Bearbeitung beschreibt (Art. 19 DSG).</w:t>
@@ -1228,6 +1625,7 @@
     <w:p>
       <w:pPr>
         <w:pStyle w:val="Heading1"/>
+        <w:keepNext/>
       </w:pPr>
       <w:r>
         <w:t xml:space="preserve">7. Verbotene Verwendungen</w:t>
@@ -1243,8 +1641,10 @@
         <w:pStyle w:val="ListParagraph"/>
         <w:numPr>
           <w:ilvl w:val="0"/>
-          <w:numId w:val="1"/>
+          <w:numId w:val="8"/>
         </w:numPr>
+        <w:spacing w:after="60"/>
+        <w:ind w:left="360" w:hanging="360"/>
       </w:pPr>
       <w:r>
         <w:t xml:space="preserve">KI zu nutzen, um Personen zu täuschen, z. B. durch gefälschte Bewertungen oder täuschend echte Bilder, Stimmen oder Videos real existierender Personen;</w:t>
@@ -1255,8 +1655,10 @@
         <w:pStyle w:val="ListParagraph"/>
         <w:numPr>
           <w:ilvl w:val="0"/>
-          <w:numId w:val="1"/>
+          <w:numId w:val="8"/>
         </w:numPr>
+        <w:spacing w:after="60"/>
+        <w:ind w:left="360" w:hanging="360"/>
       </w:pPr>
       <w:r>
         <w:t xml:space="preserve">KI zur Überwachung des Verhaltens von Mitarbeitenden einzusetzen (Art. 26 ArGV 3);</w:t>
@@ -1267,8 +1669,10 @@
         <w:pStyle w:val="ListParagraph"/>
         <w:numPr>
           <w:ilvl w:val="0"/>
-          <w:numId w:val="1"/>
+          <w:numId w:val="8"/>
         </w:numPr>
+        <w:spacing w:after="60"/>
+        <w:ind w:left="360" w:hanging="360"/>
       </w:pPr>
       <w:r>
         <w:t xml:space="preserve">KI-Ergebnisse ungeprüft als Grundlage für Entscheide über Personen zu verwenden (siehe Abschnitt 5);</w:t>
@@ -1279,8 +1683,10 @@
         <w:pStyle w:val="ListParagraph"/>
         <w:numPr>
           <w:ilvl w:val="0"/>
-          <w:numId w:val="1"/>
+          <w:numId w:val="8"/>
         </w:numPr>
+        <w:spacing w:after="60"/>
+        <w:ind w:left="360" w:hanging="360"/>
       </w:pPr>
       <w:r>
         <w:t xml:space="preserve">Sicherheitsvorkehrungen von KI-Tools oder unserer IT zu umgehen;</w:t>
@@ -1291,8 +1697,10 @@
         <w:pStyle w:val="ListParagraph"/>
         <w:numPr>
           <w:ilvl w:val="0"/>
-          <w:numId w:val="1"/>
+          <w:numId w:val="8"/>
         </w:numPr>
+        <w:spacing w:after="60"/>
+        <w:ind w:left="360" w:hanging="360"/>
       </w:pPr>
       <w:r>
         <w:rPr>
@@ -1307,6 +1715,7 @@
     <w:p>
       <w:pPr>
         <w:pStyle w:val="Heading1"/>
+        <w:keepNext/>
       </w:pPr>
       <w:r>
         <w:t xml:space="preserve">8. Verantwortlichkeiten</w:t>
@@ -1326,8 +1735,10 @@
         <w:pStyle w:val="ListParagraph"/>
         <w:numPr>
           <w:ilvl w:val="0"/>
-          <w:numId w:val="1"/>
+          <w:numId w:val="9"/>
         </w:numPr>
+        <w:spacing w:after="60"/>
+        <w:ind w:left="360" w:hanging="360"/>
       </w:pPr>
       <w:r>
         <w:t xml:space="preserve">führt die Liste der freigegebenen Tools (Anhang) und hält sie aktuell;</w:t>
@@ -1338,8 +1749,10 @@
         <w:pStyle w:val="ListParagraph"/>
         <w:numPr>
           <w:ilvl w:val="0"/>
-          <w:numId w:val="1"/>
+          <w:numId w:val="9"/>
         </w:numPr>
+        <w:spacing w:after="60"/>
+        <w:ind w:left="360" w:hanging="360"/>
       </w:pPr>
       <w:r>
         <w:t xml:space="preserve">entscheidet über Anträge für neue Tools;</w:t>
@@ -1350,8 +1763,10 @@
         <w:pStyle w:val="ListParagraph"/>
         <w:numPr>
           <w:ilvl w:val="0"/>
-          <w:numId w:val="1"/>
+          <w:numId w:val="9"/>
         </w:numPr>
+        <w:spacing w:after="60"/>
+        <w:ind w:left="360" w:hanging="360"/>
       </w:pPr>
       <w:r>
         <w:t xml:space="preserve">beantwortet Fragen zur Richtlinie;</w:t>
@@ -1362,8 +1777,10 @@
         <w:pStyle w:val="ListParagraph"/>
         <w:numPr>
           <w:ilvl w:val="0"/>
-          <w:numId w:val="1"/>
+          <w:numId w:val="9"/>
         </w:numPr>
+        <w:spacing w:after="60"/>
+        <w:ind w:left="360" w:hanging="360"/>
       </w:pPr>
       <w:r>
         <w:t xml:space="preserve">sorgt für die Schulung (Abschnitt 9) und die Behandlung von Vorfällen (Abschnitt 10);</w:t>
@@ -1374,8 +1791,10 @@
         <w:pStyle w:val="ListParagraph"/>
         <w:numPr>
           <w:ilvl w:val="0"/>
-          <w:numId w:val="1"/>
+          <w:numId w:val="9"/>
         </w:numPr>
+        <w:spacing w:after="60"/>
+        <w:ind w:left="360" w:hanging="360"/>
       </w:pPr>
       <w:r>
         <w:t xml:space="preserve">überprüft die Richtlinie mindestens jährlich.</w:t>
@@ -1408,6 +1827,7 @@
     <w:p>
       <w:pPr>
         <w:pStyle w:val="Heading1"/>
+        <w:keepNext/>
       </w:pPr>
       <w:r>
         <w:t xml:space="preserve">9. Schulung</w:t>
@@ -1430,6 +1850,7 @@
     <w:p>
       <w:pPr>
         <w:pStyle w:val="Heading1"/>
+        <w:keepNext/>
       </w:pPr>
       <w:r>
         <w:t xml:space="preserve">10. Vorfälle</w:t>
@@ -1464,8 +1885,10 @@
         <w:pStyle w:val="ListParagraph"/>
         <w:numPr>
           <w:ilvl w:val="0"/>
-          <w:numId w:val="1"/>
+          <w:numId w:val="10"/>
         </w:numPr>
+        <w:spacing w:after="60"/>
+        <w:ind w:left="360" w:hanging="360"/>
       </w:pPr>
       <w:r>
         <w:t xml:space="preserve">Daten der Stufe Gelb oder Rot in ein nicht dafür freigegebenes Tool gelangt sind;</w:t>
@@ -1476,8 +1899,10 @@
         <w:pStyle w:val="ListParagraph"/>
         <w:numPr>
           <w:ilvl w:val="0"/>
-          <w:numId w:val="1"/>
+          <w:numId w:val="10"/>
         </w:numPr>
+        <w:spacing w:after="60"/>
+        <w:ind w:left="360" w:hanging="360"/>
       </w:pPr>
       <w:r>
         <w:t xml:space="preserve">ein fehlerhaftes KI-Ergebnis an Kundschaft oder nach aussen gelangt ist;</w:t>
@@ -1488,8 +1913,10 @@
         <w:pStyle w:val="ListParagraph"/>
         <w:numPr>
           <w:ilvl w:val="0"/>
-          <w:numId w:val="1"/>
+          <w:numId w:val="10"/>
         </w:numPr>
+        <w:spacing w:after="60"/>
+        <w:ind w:left="360" w:hanging="360"/>
       </w:pPr>
       <w:r>
         <w:t xml:space="preserve">Sie vermuten, dass ein KI-Tool oder ein Konto missbraucht wird oder dass ein KI-Tool etwas getan hat, das niemand veranlasst hat;</w:t>
@@ -1500,8 +1927,10 @@
         <w:pStyle w:val="ListParagraph"/>
         <w:numPr>
           <w:ilvl w:val="0"/>
-          <w:numId w:val="1"/>
+          <w:numId w:val="10"/>
         </w:numPr>
+        <w:spacing w:after="60"/>
+        <w:ind w:left="360" w:hanging="360"/>
       </w:pPr>
       <w:r>
         <w:t xml:space="preserve">Sie eine verdächtige Anfrage erhalten haben, die gefälscht sein könnte (z. B. Anruf oder Video der Geschäftsleitung mit dringender Zahlungsanweisung).</w:t>
@@ -1515,6 +1944,7 @@
     <w:p>
       <w:pPr>
         <w:pStyle w:val="Heading1"/>
+        <w:keepNext/>
       </w:pPr>
       <w:r>
         <w:t xml:space="preserve">11. Überprüfung und Verstösse</w:t>
@@ -1540,6 +1970,7 @@
     <w:p>
       <w:pPr>
         <w:pStyle w:val="Heading1"/>
+        <w:keepNext/>
       </w:pPr>
       <w:r>
         <w:t xml:space="preserve">Kenntnisnahme</w:t>
@@ -1579,11 +2010,12 @@
           <w:insideH w:val="single" w:color="auto" w:sz="4"/>
           <w:insideV w:val="single" w:color="auto" w:sz="4"/>
         </w:tblBorders>
+        <w:tblLayout w:type="fixed"/>
       </w:tblPr>
       <w:tblGrid>
-        <w:gridCol w:w="2979"/>
-        <w:gridCol w:w="2979"/>
-        <w:gridCol w:w="2979"/>
+        <w:gridCol w:w="2575"/>
+        <w:gridCol w:w="2658"/>
+        <w:gridCol w:w="3156"/>
       </w:tblGrid>
       <w:tr>
         <w:trPr>
@@ -1591,10 +2023,19 @@
         </w:trPr>
         <w:tc>
           <w:tcPr>
-            <w:tcW w:type="pct" w:w="1650"/>
+            <w:tcW w:type="pct" w:w="1550"/>
             <w:shd w:fill="EEF2F7" w:color="auto" w:val="clear"/>
-          </w:tcPr>
-          <w:p>
+            <w:tcMar>
+              <w:top w:type="dxa" w:w="40"/>
+              <w:left w:type="dxa" w:w="60"/>
+              <w:bottom w:type="dxa" w:w="40"/>
+              <w:right w:type="dxa" w:w="60"/>
+            </w:tcMar>
+          </w:tcPr>
+          <w:p>
+            <w:pPr>
+              <w:spacing w:after="0"/>
+            </w:pPr>
             <w:r>
               <w:rPr>
                 <w:b/>
@@ -1606,10 +2047,19 @@
         </w:tc>
         <w:tc>
           <w:tcPr>
-            <w:tcW w:type="pct" w:w="1650"/>
+            <w:tcW w:type="pct" w:w="1600"/>
             <w:shd w:fill="EEF2F7" w:color="auto" w:val="clear"/>
-          </w:tcPr>
-          <w:p>
+            <w:tcMar>
+              <w:top w:type="dxa" w:w="40"/>
+              <w:left w:type="dxa" w:w="60"/>
+              <w:bottom w:type="dxa" w:w="40"/>
+              <w:right w:type="dxa" w:w="60"/>
+            </w:tcMar>
+          </w:tcPr>
+          <w:p>
+            <w:pPr>
+              <w:spacing w:after="0"/>
+            </w:pPr>
             <w:r>
               <w:rPr>
                 <w:b/>
@@ -1621,10 +2071,19 @@
         </w:tc>
         <w:tc>
           <w:tcPr>
-            <w:tcW w:type="pct" w:w="1650"/>
+            <w:tcW w:type="pct" w:w="1900"/>
             <w:shd w:fill="EEF2F7" w:color="auto" w:val="clear"/>
-          </w:tcPr>
-          <w:p>
+            <w:tcMar>
+              <w:top w:type="dxa" w:w="40"/>
+              <w:left w:type="dxa" w:w="60"/>
+              <w:bottom w:type="dxa" w:w="40"/>
+              <w:right w:type="dxa" w:w="60"/>
+            </w:tcMar>
+          </w:tcPr>
+          <w:p>
+            <w:pPr>
+              <w:spacing w:after="0"/>
+            </w:pPr>
             <w:r>
               <w:rPr>
                 <w:b/>
@@ -1638,21 +2097,51 @@
       <w:tr>
         <w:tc>
           <w:tcPr>
-            <w:tcW w:type="pct" w:w="1650"/>
-          </w:tcPr>
-          <w:p/>
-        </w:tc>
-        <w:tc>
-          <w:tcPr>
-            <w:tcW w:type="pct" w:w="1650"/>
-          </w:tcPr>
-          <w:p/>
-        </w:tc>
-        <w:tc>
-          <w:tcPr>
-            <w:tcW w:type="pct" w:w="1650"/>
-          </w:tcPr>
-          <w:p/>
+            <w:tcW w:type="pct" w:w="1550"/>
+            <w:tcMar>
+              <w:top w:type="dxa" w:w="40"/>
+              <w:left w:type="dxa" w:w="60"/>
+              <w:bottom w:type="dxa" w:w="40"/>
+              <w:right w:type="dxa" w:w="60"/>
+            </w:tcMar>
+          </w:tcPr>
+          <w:p>
+            <w:pPr>
+              <w:spacing w:after="0"/>
+            </w:pPr>
+          </w:p>
+        </w:tc>
+        <w:tc>
+          <w:tcPr>
+            <w:tcW w:type="pct" w:w="1600"/>
+            <w:tcMar>
+              <w:top w:type="dxa" w:w="40"/>
+              <w:left w:type="dxa" w:w="60"/>
+              <w:bottom w:type="dxa" w:w="40"/>
+              <w:right w:type="dxa" w:w="60"/>
+            </w:tcMar>
+          </w:tcPr>
+          <w:p>
+            <w:pPr>
+              <w:spacing w:after="0"/>
+            </w:pPr>
+          </w:p>
+        </w:tc>
+        <w:tc>
+          <w:tcPr>
+            <w:tcW w:type="pct" w:w="1900"/>
+            <w:tcMar>
+              <w:top w:type="dxa" w:w="40"/>
+              <w:left w:type="dxa" w:w="60"/>
+              <w:bottom w:type="dxa" w:w="40"/>
+              <w:right w:type="dxa" w:w="60"/>
+            </w:tcMar>
+          </w:tcPr>
+          <w:p>
+            <w:pPr>
+              <w:spacing w:after="0"/>
+            </w:pPr>
+          </w:p>
         </w:tc>
       </w:tr>
     </w:tbl>
@@ -1667,6 +2156,7 @@
     <w:p>
       <w:pPr>
         <w:pStyle w:val="Heading1"/>
+        <w:keepNext/>
       </w:pPr>
       <w:r>
         <w:t xml:space="preserve">Anhang: Verzeichnis der KI-Tools</w:t>
@@ -1692,18 +2182,19 @@
           <w:insideH w:val="single" w:color="auto" w:sz="4"/>
           <w:insideV w:val="single" w:color="auto" w:sz="4"/>
         </w:tblBorders>
+        <w:tblLayout w:type="fixed"/>
       </w:tblPr>
       <w:tblGrid>
-        <w:gridCol w:w="903"/>
-        <w:gridCol w:w="903"/>
-        <w:gridCol w:w="903"/>
-        <w:gridCol w:w="903"/>
-        <w:gridCol w:w="903"/>
-        <w:gridCol w:w="903"/>
-        <w:gridCol w:w="903"/>
-        <w:gridCol w:w="903"/>
-        <w:gridCol w:w="903"/>
-        <w:gridCol w:w="903"/>
+        <w:gridCol w:w="498"/>
+        <w:gridCol w:w="831"/>
+        <w:gridCol w:w="664"/>
+        <w:gridCol w:w="748"/>
+        <w:gridCol w:w="1080"/>
+        <w:gridCol w:w="831"/>
+        <w:gridCol w:w="748"/>
+        <w:gridCol w:w="831"/>
+        <w:gridCol w:w="997"/>
+        <w:gridCol w:w="1080"/>
       </w:tblGrid>
       <w:tr>
         <w:trPr>
@@ -1711,16 +2202,131 @@
         </w:trPr>
         <w:tc>
           <w:tcPr>
+            <w:tcW w:type="pct" w:w="300"/>
+            <w:shd w:fill="EEF2F7" w:color="auto" w:val="clear"/>
+            <w:tcMar>
+              <w:top w:type="dxa" w:w="40"/>
+              <w:left w:type="dxa" w:w="60"/>
+              <w:bottom w:type="dxa" w:w="40"/>
+              <w:right w:type="dxa" w:w="60"/>
+            </w:tcMar>
+          </w:tcPr>
+          <w:p>
+            <w:pPr>
+              <w:spacing w:after="0"/>
+            </w:pPr>
+            <w:r>
+              <w:rPr>
+                <w:b/>
+                <w:bCs/>
+                <w:sz w:val="18"/>
+                <w:szCs w:val="18"/>
+              </w:rPr>
+              <w:t xml:space="preserve">Tool</w:t>
+            </w:r>
+          </w:p>
+        </w:tc>
+        <w:tc>
+          <w:tcPr>
             <w:tcW w:type="pct" w:w="500"/>
             <w:shd w:fill="EEF2F7" w:color="auto" w:val="clear"/>
-          </w:tcPr>
-          <w:p>
+            <w:tcMar>
+              <w:top w:type="dxa" w:w="40"/>
+              <w:left w:type="dxa" w:w="60"/>
+              <w:bottom w:type="dxa" w:w="40"/>
+              <w:right w:type="dxa" w:w="60"/>
+            </w:tcMar>
+          </w:tcPr>
+          <w:p>
+            <w:pPr>
+              <w:spacing w:after="0"/>
+            </w:pPr>
             <w:r>
               <w:rPr>
                 <w:b/>
                 <w:bCs/>
-              </w:rPr>
-              <w:t xml:space="preserve">Tool</w:t>
+                <w:sz w:val="18"/>
+                <w:szCs w:val="18"/>
+              </w:rPr>
+              <w:t xml:space="preserve">Anbieter</w:t>
+            </w:r>
+          </w:p>
+        </w:tc>
+        <w:tc>
+          <w:tcPr>
+            <w:tcW w:type="pct" w:w="400"/>
+            <w:shd w:fill="EEF2F7" w:color="auto" w:val="clear"/>
+            <w:tcMar>
+              <w:top w:type="dxa" w:w="40"/>
+              <w:left w:type="dxa" w:w="60"/>
+              <w:bottom w:type="dxa" w:w="40"/>
+              <w:right w:type="dxa" w:w="60"/>
+            </w:tcMar>
+          </w:tcPr>
+          <w:p>
+            <w:pPr>
+              <w:spacing w:after="0"/>
+            </w:pPr>
+            <w:r>
+              <w:rPr>
+                <w:b/>
+                <w:bCs/>
+                <w:sz w:val="18"/>
+                <w:szCs w:val="18"/>
+              </w:rPr>
+              <w:t xml:space="preserve">Status</w:t>
+            </w:r>
+          </w:p>
+        </w:tc>
+        <w:tc>
+          <w:tcPr>
+            <w:tcW w:type="pct" w:w="450"/>
+            <w:shd w:fill="EEF2F7" w:color="auto" w:val="clear"/>
+            <w:tcMar>
+              <w:top w:type="dxa" w:w="40"/>
+              <w:left w:type="dxa" w:w="60"/>
+              <w:bottom w:type="dxa" w:w="40"/>
+              <w:right w:type="dxa" w:w="60"/>
+            </w:tcMar>
+          </w:tcPr>
+          <w:p>
+            <w:pPr>
+              <w:spacing w:after="0"/>
+            </w:pPr>
+            <w:r>
+              <w:rPr>
+                <w:b/>
+                <w:bCs/>
+                <w:sz w:val="18"/>
+                <w:szCs w:val="18"/>
+              </w:rPr>
+              <w:t xml:space="preserve">Zweck</w:t>
+            </w:r>
+          </w:p>
+        </w:tc>
+        <w:tc>
+          <w:tcPr>
+            <w:tcW w:type="pct" w:w="650"/>
+            <w:shd w:fill="EEF2F7" w:color="auto" w:val="clear"/>
+            <w:tcMar>
+              <w:top w:type="dxa" w:w="40"/>
+              <w:left w:type="dxa" w:w="60"/>
+              <w:bottom w:type="dxa" w:w="40"/>
+              <w:right w:type="dxa" w:w="60"/>
+            </w:tcMar>
+          </w:tcPr>
+          <w:p>
+            <w:pPr>
+              <w:spacing w:after="0"/>
+            </w:pPr>
+            <w:r>
+              <w:rPr>
+                <w:b/>
+                <w:bCs/>
+                <w:sz w:val="18"/>
+                <w:szCs w:val="18"/>
+              </w:rPr>
+              <w:t xml:space="preserve">Datenstufe</w:t>
             </w:r>
           </w:p>
         </w:tc>
@@ -1728,14 +2334,51 @@
           <w:tcPr>
             <w:tcW w:type="pct" w:w="500"/>
             <w:shd w:fill="EEF2F7" w:color="auto" w:val="clear"/>
-          </w:tcPr>
-          <w:p>
+            <w:tcMar>
+              <w:top w:type="dxa" w:w="40"/>
+              <w:left w:type="dxa" w:w="60"/>
+              <w:bottom w:type="dxa" w:w="40"/>
+              <w:right w:type="dxa" w:w="60"/>
+            </w:tcMar>
+          </w:tcPr>
+          <w:p>
+            <w:pPr>
+              <w:spacing w:after="0"/>
+            </w:pPr>
             <w:r>
               <w:rPr>
                 <w:b/>
                 <w:bCs/>
-              </w:rPr>
-              <w:t xml:space="preserve">Anbieter</w:t>
+                <w:sz w:val="18"/>
+                <w:szCs w:val="18"/>
+              </w:rPr>
+              <w:t xml:space="preserve">Standort</w:t>
+            </w:r>
+          </w:p>
+        </w:tc>
+        <w:tc>
+          <w:tcPr>
+            <w:tcW w:type="pct" w:w="450"/>
+            <w:shd w:fill="EEF2F7" w:color="auto" w:val="clear"/>
+            <w:tcMar>
+              <w:top w:type="dxa" w:w="40"/>
+              <w:left w:type="dxa" w:w="60"/>
+              <w:bottom w:type="dxa" w:w="40"/>
+              <w:right w:type="dxa" w:w="60"/>
+            </w:tcMar>
+          </w:tcPr>
+          <w:p>
+            <w:pPr>
+              <w:spacing w:after="0"/>
+            </w:pPr>
+            <w:r>
+              <w:rPr>
+                <w:b/>
+                <w:bCs/>
+                <w:sz w:val="18"/>
+                <w:szCs w:val="18"/>
+              </w:rPr>
+              <w:t xml:space="preserve">AVV</w:t>
             </w:r>
           </w:p>
         </w:tc>
@@ -1743,119 +2386,77 @@
           <w:tcPr>
             <w:tcW w:type="pct" w:w="500"/>
             <w:shd w:fill="EEF2F7" w:color="auto" w:val="clear"/>
-          </w:tcPr>
-          <w:p>
+            <w:tcMar>
+              <w:top w:type="dxa" w:w="40"/>
+              <w:left w:type="dxa" w:w="60"/>
+              <w:bottom w:type="dxa" w:w="40"/>
+              <w:right w:type="dxa" w:w="60"/>
+            </w:tcMar>
+          </w:tcPr>
+          <w:p>
+            <w:pPr>
+              <w:spacing w:after="0"/>
+            </w:pPr>
             <w:r>
               <w:rPr>
                 <w:b/>
                 <w:bCs/>
-              </w:rPr>
-              <w:t xml:space="preserve">Status (freigegeben / abgelehnt / in Prüfung)</w:t>
-            </w:r>
-          </w:p>
-        </w:tc>
-        <w:tc>
-          <w:tcPr>
-            <w:tcW w:type="pct" w:w="500"/>
+                <w:sz w:val="18"/>
+                <w:szCs w:val="18"/>
+              </w:rPr>
+              <w:t xml:space="preserve">Kein Training</w:t>
+            </w:r>
+          </w:p>
+        </w:tc>
+        <w:tc>
+          <w:tcPr>
+            <w:tcW w:type="pct" w:w="600"/>
             <w:shd w:fill="EEF2F7" w:color="auto" w:val="clear"/>
-          </w:tcPr>
-          <w:p>
+            <w:tcMar>
+              <w:top w:type="dxa" w:w="40"/>
+              <w:left w:type="dxa" w:w="60"/>
+              <w:bottom w:type="dxa" w:w="40"/>
+              <w:right w:type="dxa" w:w="60"/>
+            </w:tcMar>
+          </w:tcPr>
+          <w:p>
+            <w:pPr>
+              <w:spacing w:after="0"/>
+            </w:pPr>
             <w:r>
               <w:rPr>
                 <w:b/>
                 <w:bCs/>
-              </w:rPr>
-              <w:t xml:space="preserve">Zweck</w:t>
-            </w:r>
-          </w:p>
-        </w:tc>
-        <w:tc>
-          <w:tcPr>
-            <w:tcW w:type="pct" w:w="500"/>
+                <w:sz w:val="18"/>
+                <w:szCs w:val="18"/>
+              </w:rPr>
+              <w:t xml:space="preserve">Zuständig</w:t>
+            </w:r>
+          </w:p>
+        </w:tc>
+        <w:tc>
+          <w:tcPr>
+            <w:tcW w:type="pct" w:w="650"/>
             <w:shd w:fill="EEF2F7" w:color="auto" w:val="clear"/>
-          </w:tcPr>
-          <w:p>
+            <w:tcMar>
+              <w:top w:type="dxa" w:w="40"/>
+              <w:left w:type="dxa" w:w="60"/>
+              <w:bottom w:type="dxa" w:w="40"/>
+              <w:right w:type="dxa" w:w="60"/>
+            </w:tcMar>
+          </w:tcPr>
+          <w:p>
+            <w:pPr>
+              <w:spacing w:after="0"/>
+            </w:pPr>
             <w:r>
               <w:rPr>
                 <w:b/>
                 <w:bCs/>
-              </w:rPr>
-              <w:t xml:space="preserve">Datenstufe</w:t>
-            </w:r>
-          </w:p>
-        </w:tc>
-        <w:tc>
-          <w:tcPr>
-            <w:tcW w:type="pct" w:w="500"/>
-            <w:shd w:fill="EEF2F7" w:color="auto" w:val="clear"/>
-          </w:tcPr>
-          <w:p>
-            <w:r>
-              <w:rPr>
-                <w:b/>
-                <w:bCs/>
-              </w:rPr>
-              <w:t xml:space="preserve">Datenstandort</w:t>
-            </w:r>
-          </w:p>
-        </w:tc>
-        <w:tc>
-          <w:tcPr>
-            <w:tcW w:type="pct" w:w="500"/>
-            <w:shd w:fill="EEF2F7" w:color="auto" w:val="clear"/>
-          </w:tcPr>
-          <w:p>
-            <w:r>
-              <w:rPr>
-                <w:b/>
-                <w:bCs/>
-              </w:rPr>
-              <w:t xml:space="preserve">Auftragsbearbeitungsvertrag</w:t>
-            </w:r>
-          </w:p>
-        </w:tc>
-        <w:tc>
-          <w:tcPr>
-            <w:tcW w:type="pct" w:w="500"/>
-            <w:shd w:fill="EEF2F7" w:color="auto" w:val="clear"/>
-          </w:tcPr>
-          <w:p>
-            <w:r>
-              <w:rPr>
-                <w:b/>
-                <w:bCs/>
-              </w:rPr>
-              <w:t xml:space="preserve">Training ausgeschlossen</w:t>
-            </w:r>
-          </w:p>
-        </w:tc>
-        <w:tc>
-          <w:tcPr>
-            <w:tcW w:type="pct" w:w="500"/>
-            <w:shd w:fill="EEF2F7" w:color="auto" w:val="clear"/>
-          </w:tcPr>
-          <w:p>
-            <w:r>
-              <w:rPr>
-                <w:b/>
-                <w:bCs/>
-              </w:rPr>
-              <w:t xml:space="preserve">Zuständig</w:t>
-            </w:r>
-          </w:p>
-        </w:tc>
-        <w:tc>
-          <w:tcPr>
-            <w:tcW w:type="pct" w:w="500"/>
-            <w:shd w:fill="EEF2F7" w:color="auto" w:val="clear"/>
-          </w:tcPr>
-          <w:p>
-            <w:r>
-              <w:rPr>
-                <w:b/>
-                <w:bCs/>
-              </w:rPr>
-              <w:t xml:space="preserve">Letzte Prüfung</w:t>
+                <w:sz w:val="18"/>
+                <w:szCs w:val="18"/>
+              </w:rPr>
+              <w:t xml:space="preserve">Geprüft am</w:t>
             </w:r>
           </w:p>
         </w:tc>
@@ -1863,46 +2464,471 @@
       <w:tr>
         <w:tc>
           <w:tcPr>
+            <w:tcW w:type="pct" w:w="300"/>
+            <w:tcMar>
+              <w:top w:type="dxa" w:w="40"/>
+              <w:left w:type="dxa" w:w="60"/>
+              <w:bottom w:type="dxa" w:w="40"/>
+              <w:right w:type="dxa" w:w="60"/>
+            </w:tcMar>
+          </w:tcPr>
+          <w:p>
+            <w:pPr>
+              <w:spacing w:after="0"/>
+            </w:pPr>
+          </w:p>
+        </w:tc>
+        <w:tc>
+          <w:tcPr>
             <w:tcW w:type="pct" w:w="500"/>
-          </w:tcPr>
-          <w:p/>
+            <w:tcMar>
+              <w:top w:type="dxa" w:w="40"/>
+              <w:left w:type="dxa" w:w="60"/>
+              <w:bottom w:type="dxa" w:w="40"/>
+              <w:right w:type="dxa" w:w="60"/>
+            </w:tcMar>
+          </w:tcPr>
+          <w:p>
+            <w:pPr>
+              <w:spacing w:after="0"/>
+            </w:pPr>
+          </w:p>
+        </w:tc>
+        <w:tc>
+          <w:tcPr>
+            <w:tcW w:type="pct" w:w="400"/>
+            <w:tcMar>
+              <w:top w:type="dxa" w:w="40"/>
+              <w:left w:type="dxa" w:w="60"/>
+              <w:bottom w:type="dxa" w:w="40"/>
+              <w:right w:type="dxa" w:w="60"/>
+            </w:tcMar>
+          </w:tcPr>
+          <w:p>
+            <w:pPr>
+              <w:spacing w:after="0"/>
+            </w:pPr>
+          </w:p>
+        </w:tc>
+        <w:tc>
+          <w:tcPr>
+            <w:tcW w:type="pct" w:w="450"/>
+            <w:tcMar>
+              <w:top w:type="dxa" w:w="40"/>
+              <w:left w:type="dxa" w:w="60"/>
+              <w:bottom w:type="dxa" w:w="40"/>
+              <w:right w:type="dxa" w:w="60"/>
+            </w:tcMar>
+          </w:tcPr>
+          <w:p>
+            <w:pPr>
+              <w:spacing w:after="0"/>
+            </w:pPr>
+          </w:p>
+        </w:tc>
+        <w:tc>
+          <w:tcPr>
+            <w:tcW w:type="pct" w:w="650"/>
+            <w:tcMar>
+              <w:top w:type="dxa" w:w="40"/>
+              <w:left w:type="dxa" w:w="60"/>
+              <w:bottom w:type="dxa" w:w="40"/>
+              <w:right w:type="dxa" w:w="60"/>
+            </w:tcMar>
+          </w:tcPr>
+          <w:p>
+            <w:pPr>
+              <w:spacing w:after="0"/>
+            </w:pPr>
+          </w:p>
         </w:tc>
         <w:tc>
           <w:tcPr>
             <w:tcW w:type="pct" w:w="500"/>
-          </w:tcPr>
-          <w:p/>
+            <w:tcMar>
+              <w:top w:type="dxa" w:w="40"/>
+              <w:left w:type="dxa" w:w="60"/>
+              <w:bottom w:type="dxa" w:w="40"/>
+              <w:right w:type="dxa" w:w="60"/>
+            </w:tcMar>
+          </w:tcPr>
+          <w:p>
+            <w:pPr>
+              <w:spacing w:after="0"/>
+            </w:pPr>
+          </w:p>
+        </w:tc>
+        <w:tc>
+          <w:tcPr>
+            <w:tcW w:type="pct" w:w="450"/>
+            <w:tcMar>
+              <w:top w:type="dxa" w:w="40"/>
+              <w:left w:type="dxa" w:w="60"/>
+              <w:bottom w:type="dxa" w:w="40"/>
+              <w:right w:type="dxa" w:w="60"/>
+            </w:tcMar>
+          </w:tcPr>
+          <w:p>
+            <w:pPr>
+              <w:spacing w:after="0"/>
+            </w:pPr>
+            <w:r>
+              <w:rPr>
+                <w:sz w:val="18"/>
+                <w:szCs w:val="18"/>
+              </w:rPr>
+              <w:t xml:space="preserve">ja / nein</w:t>
+            </w:r>
+          </w:p>
         </w:tc>
         <w:tc>
           <w:tcPr>
             <w:tcW w:type="pct" w:w="500"/>
-          </w:tcPr>
-          <w:p/>
+            <w:tcMar>
+              <w:top w:type="dxa" w:w="40"/>
+              <w:left w:type="dxa" w:w="60"/>
+              <w:bottom w:type="dxa" w:w="40"/>
+              <w:right w:type="dxa" w:w="60"/>
+            </w:tcMar>
+          </w:tcPr>
+          <w:p>
+            <w:pPr>
+              <w:spacing w:after="0"/>
+            </w:pPr>
+            <w:r>
+              <w:rPr>
+                <w:sz w:val="18"/>
+                <w:szCs w:val="18"/>
+              </w:rPr>
+              <w:t xml:space="preserve">ja / nein</w:t>
+            </w:r>
+          </w:p>
+        </w:tc>
+        <w:tc>
+          <w:tcPr>
+            <w:tcW w:type="pct" w:w="600"/>
+            <w:tcMar>
+              <w:top w:type="dxa" w:w="40"/>
+              <w:left w:type="dxa" w:w="60"/>
+              <w:bottom w:type="dxa" w:w="40"/>
+              <w:right w:type="dxa" w:w="60"/>
+            </w:tcMar>
+          </w:tcPr>
+          <w:p>
+            <w:pPr>
+              <w:spacing w:after="0"/>
+            </w:pPr>
+          </w:p>
+        </w:tc>
+        <w:tc>
+          <w:tcPr>
+            <w:tcW w:type="pct" w:w="650"/>
+            <w:tcMar>
+              <w:top w:type="dxa" w:w="40"/>
+              <w:left w:type="dxa" w:w="60"/>
+              <w:bottom w:type="dxa" w:w="40"/>
+              <w:right w:type="dxa" w:w="60"/>
+            </w:tcMar>
+          </w:tcPr>
+          <w:p>
+            <w:pPr>
+              <w:spacing w:after="0"/>
+            </w:pPr>
+          </w:p>
+        </w:tc>
+      </w:tr>
+      <w:tr>
+        <w:tc>
+          <w:tcPr>
+            <w:tcW w:type="pct" w:w="300"/>
+            <w:tcMar>
+              <w:top w:type="dxa" w:w="40"/>
+              <w:left w:type="dxa" w:w="60"/>
+              <w:bottom w:type="dxa" w:w="40"/>
+              <w:right w:type="dxa" w:w="60"/>
+            </w:tcMar>
+          </w:tcPr>
+          <w:p>
+            <w:pPr>
+              <w:spacing w:after="0"/>
+            </w:pPr>
+          </w:p>
         </w:tc>
         <w:tc>
           <w:tcPr>
             <w:tcW w:type="pct" w:w="500"/>
-          </w:tcPr>
-          <w:p/>
+            <w:tcMar>
+              <w:top w:type="dxa" w:w="40"/>
+              <w:left w:type="dxa" w:w="60"/>
+              <w:bottom w:type="dxa" w:w="40"/>
+              <w:right w:type="dxa" w:w="60"/>
+            </w:tcMar>
+          </w:tcPr>
+          <w:p>
+            <w:pPr>
+              <w:spacing w:after="0"/>
+            </w:pPr>
+          </w:p>
+        </w:tc>
+        <w:tc>
+          <w:tcPr>
+            <w:tcW w:type="pct" w:w="400"/>
+            <w:tcMar>
+              <w:top w:type="dxa" w:w="40"/>
+              <w:left w:type="dxa" w:w="60"/>
+              <w:bottom w:type="dxa" w:w="40"/>
+              <w:right w:type="dxa" w:w="60"/>
+            </w:tcMar>
+          </w:tcPr>
+          <w:p>
+            <w:pPr>
+              <w:spacing w:after="0"/>
+            </w:pPr>
+          </w:p>
+        </w:tc>
+        <w:tc>
+          <w:tcPr>
+            <w:tcW w:type="pct" w:w="450"/>
+            <w:tcMar>
+              <w:top w:type="dxa" w:w="40"/>
+              <w:left w:type="dxa" w:w="60"/>
+              <w:bottom w:type="dxa" w:w="40"/>
+              <w:right w:type="dxa" w:w="60"/>
+            </w:tcMar>
+          </w:tcPr>
+          <w:p>
+            <w:pPr>
+              <w:spacing w:after="0"/>
+            </w:pPr>
+          </w:p>
+        </w:tc>
+        <w:tc>
+          <w:tcPr>
+            <w:tcW w:type="pct" w:w="650"/>
+            <w:tcMar>
+              <w:top w:type="dxa" w:w="40"/>
+              <w:left w:type="dxa" w:w="60"/>
+              <w:bottom w:type="dxa" w:w="40"/>
+              <w:right w:type="dxa" w:w="60"/>
+            </w:tcMar>
+          </w:tcPr>
+          <w:p>
+            <w:pPr>
+              <w:spacing w:after="0"/>
+            </w:pPr>
+          </w:p>
         </w:tc>
         <w:tc>
           <w:tcPr>
             <w:tcW w:type="pct" w:w="500"/>
-          </w:tcPr>
-          <w:p/>
+            <w:tcMar>
+              <w:top w:type="dxa" w:w="40"/>
+              <w:left w:type="dxa" w:w="60"/>
+              <w:bottom w:type="dxa" w:w="40"/>
+              <w:right w:type="dxa" w:w="60"/>
+            </w:tcMar>
+          </w:tcPr>
+          <w:p>
+            <w:pPr>
+              <w:spacing w:after="0"/>
+            </w:pPr>
+          </w:p>
+        </w:tc>
+        <w:tc>
+          <w:tcPr>
+            <w:tcW w:type="pct" w:w="450"/>
+            <w:tcMar>
+              <w:top w:type="dxa" w:w="40"/>
+              <w:left w:type="dxa" w:w="60"/>
+              <w:bottom w:type="dxa" w:w="40"/>
+              <w:right w:type="dxa" w:w="60"/>
+            </w:tcMar>
+          </w:tcPr>
+          <w:p>
+            <w:pPr>
+              <w:spacing w:after="0"/>
+            </w:pPr>
+            <w:r>
+              <w:rPr>
+                <w:sz w:val="18"/>
+                <w:szCs w:val="18"/>
+              </w:rPr>
+              <w:t xml:space="preserve">ja / nein</w:t>
+            </w:r>
+          </w:p>
         </w:tc>
         <w:tc>
           <w:tcPr>
             <w:tcW w:type="pct" w:w="500"/>
-          </w:tcPr>
-          <w:p/>
+            <w:tcMar>
+              <w:top w:type="dxa" w:w="40"/>
+              <w:left w:type="dxa" w:w="60"/>
+              <w:bottom w:type="dxa" w:w="40"/>
+              <w:right w:type="dxa" w:w="60"/>
+            </w:tcMar>
+          </w:tcPr>
+          <w:p>
+            <w:pPr>
+              <w:spacing w:after="0"/>
+            </w:pPr>
+            <w:r>
+              <w:rPr>
+                <w:sz w:val="18"/>
+                <w:szCs w:val="18"/>
+              </w:rPr>
+              <w:t xml:space="preserve">ja / nein</w:t>
+            </w:r>
+          </w:p>
+        </w:tc>
+        <w:tc>
+          <w:tcPr>
+            <w:tcW w:type="pct" w:w="600"/>
+            <w:tcMar>
+              <w:top w:type="dxa" w:w="40"/>
+              <w:left w:type="dxa" w:w="60"/>
+              <w:bottom w:type="dxa" w:w="40"/>
+              <w:right w:type="dxa" w:w="60"/>
+            </w:tcMar>
+          </w:tcPr>
+          <w:p>
+            <w:pPr>
+              <w:spacing w:after="0"/>
+            </w:pPr>
+          </w:p>
+        </w:tc>
+        <w:tc>
+          <w:tcPr>
+            <w:tcW w:type="pct" w:w="650"/>
+            <w:tcMar>
+              <w:top w:type="dxa" w:w="40"/>
+              <w:left w:type="dxa" w:w="60"/>
+              <w:bottom w:type="dxa" w:w="40"/>
+              <w:right w:type="dxa" w:w="60"/>
+            </w:tcMar>
+          </w:tcPr>
+          <w:p>
+            <w:pPr>
+              <w:spacing w:after="0"/>
+            </w:pPr>
+          </w:p>
+        </w:tc>
+      </w:tr>
+      <w:tr>
+        <w:tc>
+          <w:tcPr>
+            <w:tcW w:type="pct" w:w="300"/>
+            <w:tcMar>
+              <w:top w:type="dxa" w:w="40"/>
+              <w:left w:type="dxa" w:w="60"/>
+              <w:bottom w:type="dxa" w:w="40"/>
+              <w:right w:type="dxa" w:w="60"/>
+            </w:tcMar>
+          </w:tcPr>
+          <w:p>
+            <w:pPr>
+              <w:spacing w:after="0"/>
+            </w:pPr>
+          </w:p>
         </w:tc>
         <w:tc>
           <w:tcPr>
             <w:tcW w:type="pct" w:w="500"/>
-          </w:tcPr>
-          <w:p>
-            <w:r>
+            <w:tcMar>
+              <w:top w:type="dxa" w:w="40"/>
+              <w:left w:type="dxa" w:w="60"/>
+              <w:bottom w:type="dxa" w:w="40"/>
+              <w:right w:type="dxa" w:w="60"/>
+            </w:tcMar>
+          </w:tcPr>
+          <w:p>
+            <w:pPr>
+              <w:spacing w:after="0"/>
+            </w:pPr>
+          </w:p>
+        </w:tc>
+        <w:tc>
+          <w:tcPr>
+            <w:tcW w:type="pct" w:w="400"/>
+            <w:tcMar>
+              <w:top w:type="dxa" w:w="40"/>
+              <w:left w:type="dxa" w:w="60"/>
+              <w:bottom w:type="dxa" w:w="40"/>
+              <w:right w:type="dxa" w:w="60"/>
+            </w:tcMar>
+          </w:tcPr>
+          <w:p>
+            <w:pPr>
+              <w:spacing w:after="0"/>
+            </w:pPr>
+          </w:p>
+        </w:tc>
+        <w:tc>
+          <w:tcPr>
+            <w:tcW w:type="pct" w:w="450"/>
+            <w:tcMar>
+              <w:top w:type="dxa" w:w="40"/>
+              <w:left w:type="dxa" w:w="60"/>
+              <w:bottom w:type="dxa" w:w="40"/>
+              <w:right w:type="dxa" w:w="60"/>
+            </w:tcMar>
+          </w:tcPr>
+          <w:p>
+            <w:pPr>
+              <w:spacing w:after="0"/>
+            </w:pPr>
+          </w:p>
+        </w:tc>
+        <w:tc>
+          <w:tcPr>
+            <w:tcW w:type="pct" w:w="650"/>
+            <w:tcMar>
+              <w:top w:type="dxa" w:w="40"/>
+              <w:left w:type="dxa" w:w="60"/>
+              <w:bottom w:type="dxa" w:w="40"/>
+              <w:right w:type="dxa" w:w="60"/>
+            </w:tcMar>
+          </w:tcPr>
+          <w:p>
+            <w:pPr>
+              <w:spacing w:after="0"/>
+            </w:pPr>
+          </w:p>
+        </w:tc>
+        <w:tc>
+          <w:tcPr>
+            <w:tcW w:type="pct" w:w="500"/>
+            <w:tcMar>
+              <w:top w:type="dxa" w:w="40"/>
+              <w:left w:type="dxa" w:w="60"/>
+              <w:bottom w:type="dxa" w:w="40"/>
+              <w:right w:type="dxa" w:w="60"/>
+            </w:tcMar>
+          </w:tcPr>
+          <w:p>
+            <w:pPr>
+              <w:spacing w:after="0"/>
+            </w:pPr>
+          </w:p>
+        </w:tc>
+        <w:tc>
+          <w:tcPr>
+            <w:tcW w:type="pct" w:w="450"/>
+            <w:tcMar>
+              <w:top w:type="dxa" w:w="40"/>
+              <w:left w:type="dxa" w:w="60"/>
+              <w:bottom w:type="dxa" w:w="40"/>
+              <w:right w:type="dxa" w:w="60"/>
+            </w:tcMar>
+          </w:tcPr>
+          <w:p>
+            <w:pPr>
+              <w:spacing w:after="0"/>
+            </w:pPr>
+            <w:r>
+              <w:rPr>
+                <w:sz w:val="18"/>
+                <w:szCs w:val="18"/>
+              </w:rPr>
               <w:t xml:space="preserve">ja / nein</w:t>
             </w:r>
           </w:p>
@@ -1910,32 +2936,469 @@
         <w:tc>
           <w:tcPr>
             <w:tcW w:type="pct" w:w="500"/>
-          </w:tcPr>
-          <w:p>
-            <w:r>
+            <w:tcMar>
+              <w:top w:type="dxa" w:w="40"/>
+              <w:left w:type="dxa" w:w="60"/>
+              <w:bottom w:type="dxa" w:w="40"/>
+              <w:right w:type="dxa" w:w="60"/>
+            </w:tcMar>
+          </w:tcPr>
+          <w:p>
+            <w:pPr>
+              <w:spacing w:after="0"/>
+            </w:pPr>
+            <w:r>
+              <w:rPr>
+                <w:sz w:val="18"/>
+                <w:szCs w:val="18"/>
+              </w:rPr>
               <w:t xml:space="preserve">ja / nein</w:t>
             </w:r>
           </w:p>
         </w:tc>
         <w:tc>
           <w:tcPr>
+            <w:tcW w:type="pct" w:w="600"/>
+            <w:tcMar>
+              <w:top w:type="dxa" w:w="40"/>
+              <w:left w:type="dxa" w:w="60"/>
+              <w:bottom w:type="dxa" w:w="40"/>
+              <w:right w:type="dxa" w:w="60"/>
+            </w:tcMar>
+          </w:tcPr>
+          <w:p>
+            <w:pPr>
+              <w:spacing w:after="0"/>
+            </w:pPr>
+          </w:p>
+        </w:tc>
+        <w:tc>
+          <w:tcPr>
+            <w:tcW w:type="pct" w:w="650"/>
+            <w:tcMar>
+              <w:top w:type="dxa" w:w="40"/>
+              <w:left w:type="dxa" w:w="60"/>
+              <w:bottom w:type="dxa" w:w="40"/>
+              <w:right w:type="dxa" w:w="60"/>
+            </w:tcMar>
+          </w:tcPr>
+          <w:p>
+            <w:pPr>
+              <w:spacing w:after="0"/>
+            </w:pPr>
+          </w:p>
+        </w:tc>
+      </w:tr>
+      <w:tr>
+        <w:tc>
+          <w:tcPr>
+            <w:tcW w:type="pct" w:w="300"/>
+            <w:tcMar>
+              <w:top w:type="dxa" w:w="40"/>
+              <w:left w:type="dxa" w:w="60"/>
+              <w:bottom w:type="dxa" w:w="40"/>
+              <w:right w:type="dxa" w:w="60"/>
+            </w:tcMar>
+          </w:tcPr>
+          <w:p>
+            <w:pPr>
+              <w:spacing w:after="0"/>
+            </w:pPr>
+          </w:p>
+        </w:tc>
+        <w:tc>
+          <w:tcPr>
             <w:tcW w:type="pct" w:w="500"/>
-          </w:tcPr>
-          <w:p/>
+            <w:tcMar>
+              <w:top w:type="dxa" w:w="40"/>
+              <w:left w:type="dxa" w:w="60"/>
+              <w:bottom w:type="dxa" w:w="40"/>
+              <w:right w:type="dxa" w:w="60"/>
+            </w:tcMar>
+          </w:tcPr>
+          <w:p>
+            <w:pPr>
+              <w:spacing w:after="0"/>
+            </w:pPr>
+          </w:p>
+        </w:tc>
+        <w:tc>
+          <w:tcPr>
+            <w:tcW w:type="pct" w:w="400"/>
+            <w:tcMar>
+              <w:top w:type="dxa" w:w="40"/>
+              <w:left w:type="dxa" w:w="60"/>
+              <w:bottom w:type="dxa" w:w="40"/>
+              <w:right w:type="dxa" w:w="60"/>
+            </w:tcMar>
+          </w:tcPr>
+          <w:p>
+            <w:pPr>
+              <w:spacing w:after="0"/>
+            </w:pPr>
+          </w:p>
+        </w:tc>
+        <w:tc>
+          <w:tcPr>
+            <w:tcW w:type="pct" w:w="450"/>
+            <w:tcMar>
+              <w:top w:type="dxa" w:w="40"/>
+              <w:left w:type="dxa" w:w="60"/>
+              <w:bottom w:type="dxa" w:w="40"/>
+              <w:right w:type="dxa" w:w="60"/>
+            </w:tcMar>
+          </w:tcPr>
+          <w:p>
+            <w:pPr>
+              <w:spacing w:after="0"/>
+            </w:pPr>
+          </w:p>
+        </w:tc>
+        <w:tc>
+          <w:tcPr>
+            <w:tcW w:type="pct" w:w="650"/>
+            <w:tcMar>
+              <w:top w:type="dxa" w:w="40"/>
+              <w:left w:type="dxa" w:w="60"/>
+              <w:bottom w:type="dxa" w:w="40"/>
+              <w:right w:type="dxa" w:w="60"/>
+            </w:tcMar>
+          </w:tcPr>
+          <w:p>
+            <w:pPr>
+              <w:spacing w:after="0"/>
+            </w:pPr>
+          </w:p>
         </w:tc>
         <w:tc>
           <w:tcPr>
             <w:tcW w:type="pct" w:w="500"/>
-          </w:tcPr>
-          <w:p/>
+            <w:tcMar>
+              <w:top w:type="dxa" w:w="40"/>
+              <w:left w:type="dxa" w:w="60"/>
+              <w:bottom w:type="dxa" w:w="40"/>
+              <w:right w:type="dxa" w:w="60"/>
+            </w:tcMar>
+          </w:tcPr>
+          <w:p>
+            <w:pPr>
+              <w:spacing w:after="0"/>
+            </w:pPr>
+          </w:p>
+        </w:tc>
+        <w:tc>
+          <w:tcPr>
+            <w:tcW w:type="pct" w:w="450"/>
+            <w:tcMar>
+              <w:top w:type="dxa" w:w="40"/>
+              <w:left w:type="dxa" w:w="60"/>
+              <w:bottom w:type="dxa" w:w="40"/>
+              <w:right w:type="dxa" w:w="60"/>
+            </w:tcMar>
+          </w:tcPr>
+          <w:p>
+            <w:pPr>
+              <w:spacing w:after="0"/>
+            </w:pPr>
+            <w:r>
+              <w:rPr>
+                <w:sz w:val="18"/>
+                <w:szCs w:val="18"/>
+              </w:rPr>
+              <w:t xml:space="preserve">ja / nein</w:t>
+            </w:r>
+          </w:p>
+        </w:tc>
+        <w:tc>
+          <w:tcPr>
+            <w:tcW w:type="pct" w:w="500"/>
+            <w:tcMar>
+              <w:top w:type="dxa" w:w="40"/>
+              <w:left w:type="dxa" w:w="60"/>
+              <w:bottom w:type="dxa" w:w="40"/>
+              <w:right w:type="dxa" w:w="60"/>
+            </w:tcMar>
+          </w:tcPr>
+          <w:p>
+            <w:pPr>
+              <w:spacing w:after="0"/>
+            </w:pPr>
+            <w:r>
+              <w:rPr>
+                <w:sz w:val="18"/>
+                <w:szCs w:val="18"/>
+              </w:rPr>
+              <w:t xml:space="preserve">ja / nein</w:t>
+            </w:r>
+          </w:p>
+        </w:tc>
+        <w:tc>
+          <w:tcPr>
+            <w:tcW w:type="pct" w:w="600"/>
+            <w:tcMar>
+              <w:top w:type="dxa" w:w="40"/>
+              <w:left w:type="dxa" w:w="60"/>
+              <w:bottom w:type="dxa" w:w="40"/>
+              <w:right w:type="dxa" w:w="60"/>
+            </w:tcMar>
+          </w:tcPr>
+          <w:p>
+            <w:pPr>
+              <w:spacing w:after="0"/>
+            </w:pPr>
+          </w:p>
+        </w:tc>
+        <w:tc>
+          <w:tcPr>
+            <w:tcW w:type="pct" w:w="650"/>
+            <w:tcMar>
+              <w:top w:type="dxa" w:w="40"/>
+              <w:left w:type="dxa" w:w="60"/>
+              <w:bottom w:type="dxa" w:w="40"/>
+              <w:right w:type="dxa" w:w="60"/>
+            </w:tcMar>
+          </w:tcPr>
+          <w:p>
+            <w:pPr>
+              <w:spacing w:after="0"/>
+            </w:pPr>
+          </w:p>
+        </w:tc>
+      </w:tr>
+      <w:tr>
+        <w:tc>
+          <w:tcPr>
+            <w:tcW w:type="pct" w:w="300"/>
+            <w:tcMar>
+              <w:top w:type="dxa" w:w="40"/>
+              <w:left w:type="dxa" w:w="60"/>
+              <w:bottom w:type="dxa" w:w="40"/>
+              <w:right w:type="dxa" w:w="60"/>
+            </w:tcMar>
+          </w:tcPr>
+          <w:p>
+            <w:pPr>
+              <w:spacing w:after="0"/>
+            </w:pPr>
+          </w:p>
+        </w:tc>
+        <w:tc>
+          <w:tcPr>
+            <w:tcW w:type="pct" w:w="500"/>
+            <w:tcMar>
+              <w:top w:type="dxa" w:w="40"/>
+              <w:left w:type="dxa" w:w="60"/>
+              <w:bottom w:type="dxa" w:w="40"/>
+              <w:right w:type="dxa" w:w="60"/>
+            </w:tcMar>
+          </w:tcPr>
+          <w:p>
+            <w:pPr>
+              <w:spacing w:after="0"/>
+            </w:pPr>
+          </w:p>
+        </w:tc>
+        <w:tc>
+          <w:tcPr>
+            <w:tcW w:type="pct" w:w="400"/>
+            <w:tcMar>
+              <w:top w:type="dxa" w:w="40"/>
+              <w:left w:type="dxa" w:w="60"/>
+              <w:bottom w:type="dxa" w:w="40"/>
+              <w:right w:type="dxa" w:w="60"/>
+            </w:tcMar>
+          </w:tcPr>
+          <w:p>
+            <w:pPr>
+              <w:spacing w:after="0"/>
+            </w:pPr>
+          </w:p>
+        </w:tc>
+        <w:tc>
+          <w:tcPr>
+            <w:tcW w:type="pct" w:w="450"/>
+            <w:tcMar>
+              <w:top w:type="dxa" w:w="40"/>
+              <w:left w:type="dxa" w:w="60"/>
+              <w:bottom w:type="dxa" w:w="40"/>
+              <w:right w:type="dxa" w:w="60"/>
+            </w:tcMar>
+          </w:tcPr>
+          <w:p>
+            <w:pPr>
+              <w:spacing w:after="0"/>
+            </w:pPr>
+          </w:p>
+        </w:tc>
+        <w:tc>
+          <w:tcPr>
+            <w:tcW w:type="pct" w:w="650"/>
+            <w:tcMar>
+              <w:top w:type="dxa" w:w="40"/>
+              <w:left w:type="dxa" w:w="60"/>
+              <w:bottom w:type="dxa" w:w="40"/>
+              <w:right w:type="dxa" w:w="60"/>
+            </w:tcMar>
+          </w:tcPr>
+          <w:p>
+            <w:pPr>
+              <w:spacing w:after="0"/>
+            </w:pPr>
+          </w:p>
+        </w:tc>
+        <w:tc>
+          <w:tcPr>
+            <w:tcW w:type="pct" w:w="500"/>
+            <w:tcMar>
+              <w:top w:type="dxa" w:w="40"/>
+              <w:left w:type="dxa" w:w="60"/>
+              <w:bottom w:type="dxa" w:w="40"/>
+              <w:right w:type="dxa" w:w="60"/>
+            </w:tcMar>
+          </w:tcPr>
+          <w:p>
+            <w:pPr>
+              <w:spacing w:after="0"/>
+            </w:pPr>
+          </w:p>
+        </w:tc>
+        <w:tc>
+          <w:tcPr>
+            <w:tcW w:type="pct" w:w="450"/>
+            <w:tcMar>
+              <w:top w:type="dxa" w:w="40"/>
+              <w:left w:type="dxa" w:w="60"/>
+              <w:bottom w:type="dxa" w:w="40"/>
+              <w:right w:type="dxa" w:w="60"/>
+            </w:tcMar>
+          </w:tcPr>
+          <w:p>
+            <w:pPr>
+              <w:spacing w:after="0"/>
+            </w:pPr>
+            <w:r>
+              <w:rPr>
+                <w:sz w:val="18"/>
+                <w:szCs w:val="18"/>
+              </w:rPr>
+              <w:t xml:space="preserve">ja / nein</w:t>
+            </w:r>
+          </w:p>
+        </w:tc>
+        <w:tc>
+          <w:tcPr>
+            <w:tcW w:type="pct" w:w="500"/>
+            <w:tcMar>
+              <w:top w:type="dxa" w:w="40"/>
+              <w:left w:type="dxa" w:w="60"/>
+              <w:bottom w:type="dxa" w:w="40"/>
+              <w:right w:type="dxa" w:w="60"/>
+            </w:tcMar>
+          </w:tcPr>
+          <w:p>
+            <w:pPr>
+              <w:spacing w:after="0"/>
+            </w:pPr>
+            <w:r>
+              <w:rPr>
+                <w:sz w:val="18"/>
+                <w:szCs w:val="18"/>
+              </w:rPr>
+              <w:t xml:space="preserve">ja / nein</w:t>
+            </w:r>
+          </w:p>
+        </w:tc>
+        <w:tc>
+          <w:tcPr>
+            <w:tcW w:type="pct" w:w="600"/>
+            <w:tcMar>
+              <w:top w:type="dxa" w:w="40"/>
+              <w:left w:type="dxa" w:w="60"/>
+              <w:bottom w:type="dxa" w:w="40"/>
+              <w:right w:type="dxa" w:w="60"/>
+            </w:tcMar>
+          </w:tcPr>
+          <w:p>
+            <w:pPr>
+              <w:spacing w:after="0"/>
+            </w:pPr>
+          </w:p>
+        </w:tc>
+        <w:tc>
+          <w:tcPr>
+            <w:tcW w:type="pct" w:w="650"/>
+            <w:tcMar>
+              <w:top w:type="dxa" w:w="40"/>
+              <w:left w:type="dxa" w:w="60"/>
+              <w:bottom w:type="dxa" w:w="40"/>
+              <w:right w:type="dxa" w:w="60"/>
+            </w:tcMar>
+          </w:tcPr>
+          <w:p>
+            <w:pPr>
+              <w:spacing w:after="0"/>
+            </w:pPr>
+          </w:p>
         </w:tc>
       </w:tr>
     </w:tbl>
     <w:p/>
+    <w:p>
+      <w:r>
+        <w:rPr>
+          <w:i/>
+          <w:iCs/>
+        </w:rPr>
+        <w:t xml:space="preserve">Status:</w:t>
+      </w:r>
+      <w:r>
+        <w:t xml:space="preserve"> freigegeben, abgelehnt oder in Prüfung. </w:t>
+      </w:r>
+      <w:r>
+        <w:rPr>
+          <w:i/>
+          <w:iCs/>
+        </w:rPr>
+        <w:t xml:space="preserve">Datenstufe:</w:t>
+      </w:r>
+      <w:r>
+        <w:t xml:space="preserve"> Grün, Gelb oder Rot (Abschnitt 4). </w:t>
+      </w:r>
+      <w:r>
+        <w:rPr>
+          <w:i/>
+          <w:iCs/>
+        </w:rPr>
+        <w:t xml:space="preserve">Standort:</w:t>
+      </w:r>
+      <w:r>
+        <w:t xml:space="preserve"> wo der Anbieter die Daten bearbeitet und speichert (z. B. CH, EU, USA). </w:t>
+      </w:r>
+      <w:r>
+        <w:rPr>
+          <w:i/>
+          <w:iCs/>
+        </w:rPr>
+        <w:t xml:space="preserve">AVV:</w:t>
+      </w:r>
+      <w:r>
+        <w:t xml:space="preserve"> Auftragsbearbeitungsvertrag mit dem Anbieter vorhanden. </w:t>
+      </w:r>
+      <w:r>
+        <w:rPr>
+          <w:i/>
+          <w:iCs/>
+        </w:rPr>
+        <w:t xml:space="preserve">Kein Training:</w:t>
+      </w:r>
+      <w:r>
+        <w:t xml:space="preserve"> Der Anbieter verwendet Ihre Daten nicht zum Trainieren seiner Modelle.</w:t>
+      </w:r>
+    </w:p>
     <w:sectPr>
       <w:footerReference w:type="default" r:id="rId6"/>
       <w:pgSz w:w="11906" w:h="16838" w:orient="portrait"/>
-      <w:pgMar w:top="1440" w:right="1440" w:bottom="1440" w:left="1440" w:header="708" w:footer="708" w:gutter="0"/>
+      <w:pgMar w:top="1134" w:right="1800" w:bottom="1134" w:left="1800" w:header="708" w:footer="708" w:gutter="0"/>
       <w:pgNumType/>
       <w:docGrid w:linePitch="360"/>
     </w:sectPr>
@@ -2162,6 +3625,36 @@
       </w:pPr>
     </w:lvl>
   </w:abstractNum>
+  <w:abstractNum w:abstractNumId="3" w15:restartNumberingAfterBreak="0">
+    <w:multiLevelType w:val="hybridMultilevel"/>
+    <w:lvl w:ilvl="0" w:tentative="1">
+      <w:start w:val="1"/>
+      <w:numFmt w:val="bullet"/>
+      <w:lvlText w:val="•"/>
+      <w:lvlJc w:val="left"/>
+      <w:pPr>
+        <w:ind w:left="360" w:hanging="360"/>
+      </w:pPr>
+    </w:lvl>
+    <w:lvl w:ilvl="1" w:tentative="1">
+      <w:start w:val="1"/>
+      <w:numFmt w:val="bullet"/>
+      <w:lvlText w:val="–"/>
+      <w:lvlJc w:val="left"/>
+      <w:pPr>
+        <w:ind w:left="720" w:hanging="360"/>
+      </w:pPr>
+    </w:lvl>
+    <w:lvl w:ilvl="2" w:tentative="1">
+      <w:start w:val="1"/>
+      <w:numFmt w:val="bullet"/>
+      <w:lvlText w:val="•"/>
+      <w:lvlJc w:val="left"/>
+      <w:pPr>
+        <w:ind w:left="1080" w:hanging="360"/>
+      </w:pPr>
+    </w:lvl>
+  </w:abstractNum>
   <w:num w:numId="1">
     <w:abstractNumId w:val="1"/>
     <w:lvlOverride w:ilvl="0">
@@ -2169,13 +3662,55 @@
     </w:lvlOverride>
   </w:num>
   <w:num w:numId="2">
+    <w:abstractNumId w:val="3"/>
+    <w:lvlOverride w:ilvl="0">
+      <w:startOverride w:val="1"/>
+    </w:lvlOverride>
+  </w:num>
+  <w:num w:numId="3">
+    <w:abstractNumId w:val="3"/>
+    <w:lvlOverride w:ilvl="0">
+      <w:startOverride w:val="1"/>
+    </w:lvlOverride>
+  </w:num>
+  <w:num w:numId="4">
     <w:abstractNumId w:val="2"/>
     <w:lvlOverride w:ilvl="0">
       <w:startOverride w:val="1"/>
     </w:lvlOverride>
   </w:num>
-  <w:num w:numId="3">
+  <w:num w:numId="5">
+    <w:abstractNumId w:val="3"/>
+    <w:lvlOverride w:ilvl="0">
+      <w:startOverride w:val="1"/>
+    </w:lvlOverride>
+  </w:num>
+  <w:num w:numId="6">
     <w:abstractNumId w:val="2"/>
+    <w:lvlOverride w:ilvl="0">
+      <w:startOverride w:val="1"/>
+    </w:lvlOverride>
+  </w:num>
+  <w:num w:numId="7">
+    <w:abstractNumId w:val="3"/>
+    <w:lvlOverride w:ilvl="0">
+      <w:startOverride w:val="1"/>
+    </w:lvlOverride>
+  </w:num>
+  <w:num w:numId="8">
+    <w:abstractNumId w:val="3"/>
+    <w:lvlOverride w:ilvl="0">
+      <w:startOverride w:val="1"/>
+    </w:lvlOverride>
+  </w:num>
+  <w:num w:numId="9">
+    <w:abstractNumId w:val="3"/>
+    <w:lvlOverride w:ilvl="0">
+      <w:startOverride w:val="1"/>
+    </w:lvlOverride>
+  </w:num>
+  <w:num w:numId="10">
+    <w:abstractNumId w:val="3"/>
     <w:lvlOverride w:ilvl="0">
       <w:startOverride w:val="1"/>
     </w:lvlOverride>
@@ -2193,7 +3728,11 @@
         <w:szCs w:val="22"/>
       </w:rPr>
     </w:rPrDefault>
-    <w:pPrDefault/>
+    <w:pPrDefault>
+      <w:pPr>
+        <w:spacing w:after="120"/>
+      </w:pPr>
+    </w:pPrDefault>
   </w:docDefaults>
   <w:style w:type="paragraph" w:styleId="Normal" w:default="1">
     <w:name w:val="Normal"/>
@@ -2204,9 +3743,12 @@
     <w:basedOn w:val="Normal"/>
     <w:next w:val="Normal"/>
     <w:qFormat/>
+    <w:pPr>
+      <w:spacing w:after="240"/>
+    </w:pPr>
     <w:rPr>
-      <w:sz w:val="56"/>
-      <w:szCs w:val="56"/>
+      <w:sz w:val="40"/>
+      <w:szCs w:val="40"/>
     </w:rPr>
   </w:style>
   <w:style w:type="paragraph" w:styleId="Heading1">
@@ -2214,6 +3756,9 @@
     <w:basedOn w:val="Normal"/>
     <w:next w:val="Normal"/>
     <w:qFormat/>
+    <w:pPr>
+      <w:spacing w:after="120" w:before="480"/>
+    </w:pPr>
     <w:rPr>
       <w:color w:val="2E74B5"/>
       <w:sz w:val="32"/>
@@ -2225,6 +3770,9 @@
     <w:basedOn w:val="Normal"/>
     <w:next w:val="Normal"/>
     <w:qFormat/>
+    <w:pPr>
+      <w:spacing w:after="80" w:before="240"/>
+    </w:pPr>
     <w:rPr>
       <w:color w:val="2E74B5"/>
       <w:sz w:val="26"/>

</xml_diff>

<commit_message>
content(de): legal and style review of the German copy before T29
- EU AI Act guide, decision tool and procurement checklist: Digital Omnibus
  on AI (Regulation (EU) 2026/1744) is in force since 27 July 2026; current
  timeline, rewritten Art. 4, new prohibitions (tool strings in all locales)
- Datenschutzerklärung: accurate unlinkability and IP-hash wording, transfer
  disclosure (Art. 19 Abs. 4 DSG), DSG instead of GDPR legal-basis wording,
  KI-Check/decision tools section
- DSG precision (Art. 21, EDÖB attribution, fines, record-keeping exemption),
  FINMA guidance not binding law, UWG/FMG references in the Website-Check
- Postal address removed from Impressum and Datenschutz (all locales)
- Homepage headline and copy style; review memo in docs/de-copy-review.md

Co-Authored-By: Claude Opus 5.5 <noreply@anthropic.com>
</commit_message>
<xml_diff>
--- a/public/downloads/ai-policy-template-de.docx
+++ b/public/downloads/ai-policy-template-de.docx
@@ -1140,8 +1140,8 @@
       </w:tblPr>
       <w:tblGrid>
         <w:gridCol w:w="1661"/>
-        <w:gridCol w:w="4236"/>
-        <w:gridCol w:w="2492"/>
+        <w:gridCol w:w="4402"/>
+        <w:gridCol w:w="2243"/>
       </w:tblGrid>
       <w:tr>
         <w:trPr>
@@ -1173,7 +1173,7 @@
         </w:tc>
         <w:tc>
           <w:tcPr>
-            <w:tcW w:type="pct" w:w="2550"/>
+            <w:tcW w:type="pct" w:w="2650"/>
             <w:shd w:fill="EEF2F7" w:color="auto" w:val="clear"/>
             <w:tcMar>
               <w:top w:type="dxa" w:w="40"/>
@@ -1197,7 +1197,7 @@
         </w:tc>
         <w:tc>
           <w:tcPr>
-            <w:tcW w:type="pct" w:w="1500"/>
+            <w:tcW w:type="pct" w:w="1350"/>
             <w:shd w:fill="EEF2F7" w:color="auto" w:val="clear"/>
             <w:tcMar>
               <w:top w:type="dxa" w:w="40"/>
@@ -1252,7 +1252,7 @@
         </w:tc>
         <w:tc>
           <w:tcPr>
-            <w:tcW w:type="pct" w:w="2550"/>
+            <w:tcW w:type="pct" w:w="2650"/>
             <w:tcMar>
               <w:top w:type="dxa" w:w="40"/>
               <w:left w:type="dxa" w:w="60"/>
@@ -1271,7 +1271,7 @@
         </w:tc>
         <w:tc>
           <w:tcPr>
-            <w:tcW w:type="pct" w:w="1500"/>
+            <w:tcW w:type="pct" w:w="1350"/>
             <w:tcMar>
               <w:top w:type="dxa" w:w="40"/>
               <w:left w:type="dxa" w:w="60"/>
@@ -1321,7 +1321,7 @@
         </w:tc>
         <w:tc>
           <w:tcPr>
-            <w:tcW w:type="pct" w:w="2550"/>
+            <w:tcW w:type="pct" w:w="2650"/>
             <w:tcMar>
               <w:top w:type="dxa" w:w="40"/>
               <w:left w:type="dxa" w:w="60"/>
@@ -1340,7 +1340,7 @@
         </w:tc>
         <w:tc>
           <w:tcPr>
-            <w:tcW w:type="pct" w:w="1500"/>
+            <w:tcW w:type="pct" w:w="1350"/>
             <w:tcMar>
               <w:top w:type="dxa" w:w="40"/>
               <w:left w:type="dxa" w:w="60"/>
@@ -1390,26 +1390,26 @@
         </w:tc>
         <w:tc>
           <w:tcPr>
-            <w:tcW w:type="pct" w:w="2550"/>
-            <w:tcMar>
-              <w:top w:type="dxa" w:w="40"/>
-              <w:left w:type="dxa" w:w="60"/>
-              <w:bottom w:type="dxa" w:w="40"/>
-              <w:right w:type="dxa" w:w="60"/>
-            </w:tcMar>
-          </w:tcPr>
-          <w:p>
-            <w:pPr>
-              <w:spacing w:after="0"/>
-            </w:pPr>
-            <w:r>
-              <w:t xml:space="preserve">Gesundheitsdaten, Angaben zu Religion, Politik, Strafverfahren oder Sozialhilfe (besonders schützenswerte Personendaten, Art. 5 lit. c DSG); Daten unter Berufsgeheimnis; Geschäftsgeheimnisse von Kundschaft; Passwörter, Zugangsdaten, Bank- und Kartendaten</w:t>
-            </w:r>
-          </w:p>
-        </w:tc>
-        <w:tc>
-          <w:tcPr>
-            <w:tcW w:type="pct" w:w="1500"/>
+            <w:tcW w:type="pct" w:w="2650"/>
+            <w:tcMar>
+              <w:top w:type="dxa" w:w="40"/>
+              <w:left w:type="dxa" w:w="60"/>
+              <w:bottom w:type="dxa" w:w="40"/>
+              <w:right w:type="dxa" w:w="60"/>
+            </w:tcMar>
+          </w:tcPr>
+          <w:p>
+            <w:pPr>
+              <w:spacing w:after="0"/>
+            </w:pPr>
+            <w:r>
+              <w:t xml:space="preserve">Besonders schützenswerte Personendaten (Art. 5 lit. c DSG), z. B. zu Gesundheit, Religion, politischen Ansichten, Gewerkschaftszugehörigkeit oder Ethnie, genetische und biometrische Daten, Angaben zu Strafverfahren oder Sozialhilfe; Daten unter Berufsgeheimnis; Geschäftsgeheimnisse von Kundschaft; Passwörter, Zugangsdaten, Bank- und Kartendaten</w:t>
+            </w:r>
+          </w:p>
+        </w:tc>
+        <w:tc>
+          <w:tcPr>
+            <w:tcW w:type="pct" w:w="1350"/>
             <w:tcMar>
               <w:top w:type="dxa" w:w="40"/>
               <w:left w:type="dxa" w:w="60"/>
@@ -1510,7 +1510,7 @@
         <w:t xml:space="preserve">Keine Entscheide über Personen ohne Menschen.</w:t>
       </w:r>
       <w:r>
-        <w:t xml:space="preserve"> KI darf Entscheide über Personen (z. B. Bewerbungen, Kreditwürdigkeit, Preise, Kündigungen) vorbereiten, aber nicht allein treffen. Eine Person prüft jeden solchen Entscheid inhaltlich und hält fest, wie sie entschieden hat. Betroffene können verlangen, dass eine Person ihren Fall beurteilt (Art. 21 DSG).</w:t>
+        <w:t xml:space="preserve"> KI darf Entscheide über Personen (z. B. Bewerbungen, Kreditwürdigkeit, Preise, Kündigungen) vorbereiten, aber nicht allein treffen. Eine Person prüft jeden solchen Entscheid inhaltlich und hält fest, wie sie entschieden hat. So entstehen keine ausschliesslich automatisierten Einzelentscheide, für die besondere Informations- und Überprüfungspflichten gelten (Art. 21 DSG).</w:t>
       </w:r>
     </w:p>
     <w:p>
@@ -1619,7 +1619,7 @@
         <w:ind w:left="360" w:hanging="360"/>
       </w:pPr>
       <w:r>
-        <w:t xml:space="preserve">Die KI-verantwortliche Person sorgt dafür, dass die Datenschutzerklärung die KI-Tools nennt, mit denen Personendaten bearbeitet werden, und den Zweck der Bearbeitung beschreibt (Art. 19 DSG).</w:t>
+        <w:t xml:space="preserve">Die KI-verantwortliche Person sorgt dafür, dass die Datenschutzerklärung über die Bearbeitung von Personendaten mit KI-Tools informiert: Zweck, Empfänger oder Kategorien von Empfängern (z. B. die Anbieter) und gegebenenfalls die Staaten, in die Daten gelangen (Art. 19 DSG).</w:t>
       </w:r>
     </w:p>
     <w:p>
@@ -1661,7 +1661,7 @@
         <w:ind w:left="360" w:hanging="360"/>
       </w:pPr>
       <w:r>
-        <w:t xml:space="preserve">KI zur Überwachung des Verhaltens von Mitarbeitenden einzusetzen (Art. 26 ArGV 3);</w:t>
+        <w:t xml:space="preserve">KI zur Überwachung des Verhaltens von Mitarbeitenden einzusetzen (Art. 26 ArGV 3) oder um Daten über Mitarbeitende zu bearbeiten, die nicht ihre Eignung für die Stelle oder die Durchführung des Arbeitsvertrags betreffen (Art. 328b OR);</w:t>
       </w:r>
     </w:p>
     <w:p>
@@ -1938,7 +1938,7 @@
     </w:p>
     <w:p>
       <w:r>
-        <w:t xml:space="preserve">Eine Meldung ist erwünscht und hat keine Nachteile zur Folge, wenn sie rasch erfolgt. Die KI-verantwortliche Person begrenzt den Schaden, dokumentiert den Vorfall und prüft, ob eine Meldung an den Eidgenössischen Datenschutz- und Öffentlichkeitsbeauftragten (EDÖB) nötig ist (Art. 24 DSG) und ob Betroffene informiert werden müssen.</w:t>
+        <w:t xml:space="preserve">Rasche Meldungen sind erwünscht. Wer einen Vorfall meldet, muss wegen der Meldung selbst keine Nachteile befürchten. Die KI-verantwortliche Person begrenzt den Schaden, dokumentiert den Vorfall und prüft, ob eine Meldung an den Eidgenössischen Datenschutz- und Öffentlichkeitsbeauftragten (EDÖB) nötig ist (Art. 24 DSG) und ob Betroffene informiert werden müssen.</w:t>
       </w:r>
     </w:p>
     <w:p>

</xml_diff>